<commit_message>
feat: unify asset breakdown workflows and UI
</commit_message>
<xml_diff>
--- a/GATalk_使用手册.docx
+++ b/GATalk_使用手册.docx
@@ -27,7 +27,7 @@
           <w:color w:val="5A5A5A"/>
           <w:sz w:val="19"/>
         </w:rPr>
-        <w:t>适用版本：0.11.0（生产级资产拆分规划）　更新日期：2026-08-07</w:t>
+        <w:t>适用版本：0.12.0（统一拆分依据与资产工作流界面）　更新日期：2026-08-08</w:t>
       </w:r>
     </w:p>
     <w:p>
@@ -731,7 +731,7 @@
           <w:b w:val="0"/>
           <w:sz w:val="22"/>
         </w:rPr>
-        <w:t>在“可校正拆分 → 场景理解与拆分方案”选择视觉供应商，查看发送清单并主动确认。</w:t>
+        <w:t>在“清单与校正 → 拆分依据”选择视觉供应商，检查发送内容并主动确认。</w:t>
       </w:r>
     </w:p>
     <w:p>
@@ -748,7 +748,7 @@
           <w:b w:val="0"/>
           <w:sz w:val="22"/>
         </w:rPr>
-        <w:t>先检查 AI 对空间层级、建筑或自然系统、重复规律、遮挡和不确定性的理解，并写入人工修正。</w:t>
+        <w:t>先检查空间层级、建筑或自然系统、重复规律、遮挡和不确定性，并写入人工修正。</w:t>
       </w:r>
     </w:p>
     <w:p>
@@ -816,7 +816,7 @@
           <w:b w:val="0"/>
           <w:sz w:val="22"/>
         </w:rPr>
-        <w:t>AI 建议只是起点；用户可修改方案名称、用途、每类深度、分组方式、单页上限和备注。</w:t>
+        <w:t>分析建议只是起点；用户可修改方案名称、用途、每类深度、分组方式、单页上限和备注。</w:t>
       </w:r>
     </w:p>
     <w:p>
@@ -881,7 +881,7 @@
           <w:b w:val="0"/>
           <w:sz w:val="22"/>
         </w:rPr>
-        <w:t>先完成场景理解，选择并确认当前拆分方案。</w:t>
+        <w:t>先确认场景结构，选择并保存当前拆分方案。</w:t>
       </w:r>
     </w:p>
     <w:p>
@@ -1247,6 +1247,105 @@
           <w:sz w:val="22"/>
         </w:rPr>
         <w:t>AI 生成的独立资产图和展示板仍是概念辅助，不等于生产模型、真实背面或确定结构。</w:t>
+      </w:r>
+    </w:p>
+    <w:p>
+      <w:pPr>
+        <w:pStyle w:val="Heading2"/>
+      </w:pPr>
+      <w:r>
+        <w:rPr>
+          <w:rFonts w:ascii="Calibri" w:hAnsi="Calibri" w:eastAsia="Microsoft YaHei UI"/>
+          <w:b/>
+          <w:color w:val="2E74B5"/>
+          <w:sz w:val="26"/>
+        </w:rPr>
+        <w:t>三种工作方式</w:t>
+      </w:r>
+    </w:p>
+    <w:p>
+      <w:pPr>
+        <w:spacing w:before="0" w:after="80" w:line="300" w:lineRule="auto"/>
+        <w:numPr>
+          <w:ilvl w:val="0"/>
+          <w:numId w:val="10"/>
+        </w:numPr>
+      </w:pPr>
+      <w:r>
+        <w:rPr>
+          <w:rFonts w:ascii="Calibri" w:hAnsi="Calibri" w:eastAsia="Microsoft YaHei UI"/>
+          <w:b w:val="0"/>
+          <w:sz w:val="22"/>
+        </w:rPr>
+        <w:t>清单与校正：按当前方案生成结构化清单，再人工修改区域、分类、层级和复用关系。</w:t>
+      </w:r>
+    </w:p>
+    <w:p>
+      <w:pPr>
+        <w:spacing w:before="0" w:after="80" w:line="300" w:lineRule="auto"/>
+        <w:numPr>
+          <w:ilvl w:val="0"/>
+          <w:numId w:val="10"/>
+        </w:numPr>
+      </w:pPr>
+      <w:r>
+        <w:rPr>
+          <w:rFonts w:ascii="Calibri" w:hAnsi="Calibri" w:eastAsia="Microsoft YaHei UI"/>
+          <w:b w:val="0"/>
+          <w:sz w:val="22"/>
+        </w:rPr>
+        <w:t>自动资产板：按当前方案批量生成单项概念图和分页展示板；结果不写入人工校正清单。</w:t>
+      </w:r>
+    </w:p>
+    <w:p>
+      <w:pPr>
+        <w:spacing w:before="0" w:after="80" w:line="300" w:lineRule="auto"/>
+        <w:numPr>
+          <w:ilvl w:val="0"/>
+          <w:numId w:val="10"/>
+        </w:numPr>
+      </w:pPr>
+      <w:r>
+        <w:rPr>
+          <w:rFonts w:ascii="Calibri" w:hAnsi="Calibri" w:eastAsia="Microsoft YaHei UI"/>
+          <w:b w:val="0"/>
+          <w:sz w:val="22"/>
+        </w:rPr>
+        <w:t>生成提示语：把当前场景结构与逐类别拆分深度写入可复制的外部生图指令，可继续修订或手动编辑。</w:t>
+      </w:r>
+    </w:p>
+    <w:p>
+      <w:pPr>
+        <w:spacing w:before="0" w:after="80" w:line="300" w:lineRule="auto"/>
+        <w:numPr>
+          <w:ilvl w:val="0"/>
+          <w:numId w:val="10"/>
+        </w:numPr>
+      </w:pPr>
+      <w:r>
+        <w:rPr>
+          <w:rFonts w:ascii="Calibri" w:hAnsi="Calibri" w:eastAsia="Microsoft YaHei UI"/>
+          <w:b w:val="0"/>
+          <w:sz w:val="22"/>
+        </w:rPr>
+        <w:t>工作区顶部固定显示当前拆分依据。三种方式共享方案，但输出独立保存。</w:t>
+      </w:r>
+    </w:p>
+    <w:p>
+      <w:pPr>
+        <w:spacing w:before="0" w:after="80" w:line="300" w:lineRule="auto"/>
+        <w:numPr>
+          <w:ilvl w:val="0"/>
+          <w:numId w:val="10"/>
+        </w:numPr>
+      </w:pPr>
+      <w:r>
+        <w:rPr>
+          <w:rFonts w:ascii="Calibri" w:hAnsi="Calibri" w:eastAsia="Microsoft YaHei UI"/>
+          <w:b w:val="0"/>
+          <w:sz w:val="22"/>
+        </w:rPr>
+        <w:t>方案修改后，旧自动资产板和旧提示语会标记为旧版依据；历史文件不会删除。</w:t>
       </w:r>
     </w:p>
     <w:p>

</xml_diff>

<commit_message>
fix: improve asset workspace spacing and scrolling
</commit_message>
<xml_diff>
--- a/GATalk_使用手册.docx
+++ b/GATalk_使用手册.docx
@@ -27,7 +27,7 @@
           <w:color w:val="5A5A5A"/>
           <w:sz w:val="19"/>
         </w:rPr>
-        <w:t>适用版本：0.12.0（统一拆分依据与资产工作流界面）　更新日期：2026-08-08</w:t>
+        <w:t>适用版本：0.12.1（资产工作台布局与滚动优化）　更新日期：2026-08-08</w:t>
       </w:r>
     </w:p>
     <w:p>
@@ -1346,6 +1346,88 @@
           <w:sz w:val="22"/>
         </w:rPr>
         <w:t>方案修改后，旧自动资产板和旧提示语会标记为旧版依据；历史文件不会删除。</w:t>
+      </w:r>
+    </w:p>
+    <w:p>
+      <w:pPr>
+        <w:pStyle w:val="Heading2"/>
+      </w:pPr>
+      <w:r>
+        <w:rPr>
+          <w:rFonts w:ascii="Calibri" w:hAnsi="Calibri" w:eastAsia="Microsoft YaHei UI"/>
+          <w:b/>
+          <w:color w:val="2E74B5"/>
+          <w:sz w:val="26"/>
+        </w:rPr>
+        <w:t>右侧工作区与滚动</w:t>
+      </w:r>
+    </w:p>
+    <w:p>
+      <w:pPr>
+        <w:spacing w:before="0" w:after="80" w:line="300" w:lineRule="auto"/>
+        <w:numPr>
+          <w:ilvl w:val="0"/>
+          <w:numId w:val="10"/>
+        </w:numPr>
+      </w:pPr>
+      <w:r>
+        <w:rPr>
+          <w:rFonts w:ascii="Calibri" w:hAnsi="Calibri" w:eastAsia="Microsoft YaHei UI"/>
+          <w:b w:val="0"/>
+          <w:sz w:val="22"/>
+        </w:rPr>
+        <w:t>右侧页面按当前任务分段排列，不要求在一个屏幕内显示全部内容。</w:t>
+      </w:r>
+    </w:p>
+    <w:p>
+      <w:pPr>
+        <w:spacing w:before="0" w:after="80" w:line="300" w:lineRule="auto"/>
+        <w:numPr>
+          <w:ilvl w:val="0"/>
+          <w:numId w:val="10"/>
+        </w:numPr>
+      </w:pPr>
+      <w:r>
+        <w:rPr>
+          <w:rFonts w:ascii="Calibri" w:hAnsi="Calibri" w:eastAsia="Microsoft YaHei UI"/>
+          <w:b w:val="0"/>
+          <w:sz w:val="22"/>
+        </w:rPr>
+        <w:t>内容超过窗口高度时会显示纵向滚动条；鼠标放在右侧即可滚轮滚动。</w:t>
+      </w:r>
+    </w:p>
+    <w:p>
+      <w:pPr>
+        <w:spacing w:before="0" w:after="80" w:line="300" w:lineRule="auto"/>
+        <w:numPr>
+          <w:ilvl w:val="0"/>
+          <w:numId w:val="10"/>
+        </w:numPr>
+      </w:pPr>
+      <w:r>
+        <w:rPr>
+          <w:rFonts w:ascii="Calibri" w:hAnsi="Calibri" w:eastAsia="Microsoft YaHei UI"/>
+          <w:b w:val="0"/>
+          <w:sz w:val="22"/>
+        </w:rPr>
+        <w:t>拆分依据、资产详情、生成与导出、自动资产板和生成提示语均支持纵向滚动。</w:t>
+      </w:r>
+    </w:p>
+    <w:p>
+      <w:pPr>
+        <w:spacing w:before="0" w:after="80" w:line="300" w:lineRule="auto"/>
+        <w:numPr>
+          <w:ilvl w:val="0"/>
+          <w:numId w:val="10"/>
+        </w:numPr>
+      </w:pPr>
+      <w:r>
+        <w:rPr>
+          <w:rFonts w:ascii="Calibri" w:hAnsi="Calibri" w:eastAsia="Microsoft YaHei UI"/>
+          <w:b w:val="0"/>
+          <w:sz w:val="22"/>
+        </w:rPr>
+        <w:t>中央原画画布独立显示，不会随右侧页面滚动。</w:t>
       </w:r>
     </w:p>
     <w:p>

</xml_diff>

<commit_message>
docs: document GATalk 0.16.0 evidence workflow
</commit_message>
<xml_diff>
--- a/GATalk_使用手册.docx
+++ b/GATalk_使用手册.docx
@@ -23,7 +23,7 @@
           <w:b w:val="0"/>
           <w:sz w:val="22"/>
         </w:rPr>
-        <w:t>适用版本：0.15.0（全局检索、项目恢复、生产控制与视觉资料板） 更新日期：2026-08-08</w:t>
+        <w:t>适用版本：0.16.0（双图证据、灯光审片、AI 审阅历史与统一导航） 更新日期：2026-08-12</w:t>
       </w:r>
     </w:p>
     <w:p>
@@ -231,7 +231,7 @@
           <w:b w:val="0"/>
           <w:sz w:val="22"/>
         </w:rPr>
-        <w:t>模块内选择“文件 → 工作台首页”可返回。</w:t>
+        <w:t>每个专业工作台顶部都有固定的“工作台首页”大按钮，旁边是 全局检索、任务中心和全局设置。模块自己的导入和分析工具在下一行。</w:t>
       </w:r>
     </w:p>
     <w:p>
@@ -3792,6 +3792,98 @@
           <w:color w:val="2E74B5"/>
           <w:sz w:val="26"/>
         </w:rPr>
+        <w:t>双图证据概览</w:t>
+      </w:r>
+    </w:p>
+    <w:p>
+      <w:pPr>
+        <w:spacing w:before="0" w:after="80" w:line="300" w:lineRule="auto"/>
+        <w:numPr>
+          <w:ilvl w:val="0"/>
+          <w:numId w:val="25"/>
+        </w:numPr>
+      </w:pPr>
+      <w:r>
+        <w:rPr>
+          <w:rFonts w:ascii="Calibri" w:hAnsi="Calibri" w:eastAsia="Microsoft YaHei UI"/>
+          <w:b w:val="0"/>
+          <w:sz w:val="22"/>
+        </w:rPr>
+        <w:t>打开“对比分析”，在最上方查看参考图和当前截图的独立色板。</w:t>
+      </w:r>
+    </w:p>
+    <w:p>
+      <w:pPr>
+        <w:spacing w:before="0" w:after="80" w:line="300" w:lineRule="auto"/>
+        <w:numPr>
+          <w:ilvl w:val="0"/>
+          <w:numId w:val="25"/>
+        </w:numPr>
+      </w:pPr>
+      <w:r>
+        <w:rPr>
+          <w:rFonts w:ascii="Calibri" w:hAnsi="Calibri" w:eastAsia="Microsoft YaHei UI"/>
+          <w:b w:val="0"/>
+          <w:sz w:val="22"/>
+        </w:rPr>
+        <w:t>在“观察指标”切换相对明度、Oklab 明度、彩度、色相或饱和度。</w:t>
+      </w:r>
+    </w:p>
+    <w:p>
+      <w:pPr>
+        <w:spacing w:before="0" w:after="80" w:line="300" w:lineRule="auto"/>
+        <w:numPr>
+          <w:ilvl w:val="0"/>
+          <w:numId w:val="25"/>
+        </w:numPr>
+      </w:pPr>
+      <w:r>
+        <w:rPr>
+          <w:rFonts w:ascii="Calibri" w:hAnsi="Calibri" w:eastAsia="Microsoft YaHei UI"/>
+          <w:b w:val="0"/>
+          <w:sz w:val="22"/>
+        </w:rPr>
+        <w:t>选择 16、32、64 或 128 档；取消勾选可临时隐藏任一张图的曲线。</w:t>
+      </w:r>
+    </w:p>
+    <w:p>
+      <w:pPr>
+        <w:spacing w:before="0" w:after="80" w:line="300" w:lineRule="auto"/>
+        <w:numPr>
+          <w:ilvl w:val="0"/>
+          <w:numId w:val="25"/>
+        </w:numPr>
+      </w:pPr>
+      <w:r>
+        <w:rPr>
+          <w:rFonts w:ascii="Calibri" w:hAnsi="Calibri" w:eastAsia="Microsoft YaHei UI"/>
+          <w:b w:val="0"/>
+          <w:sz w:val="22"/>
+        </w:rPr>
+        <w:t>色相模式会排除低彩度像素，并显示双方中性色比例。</w:t>
+      </w:r>
+    </w:p>
+    <w:p>
+      <w:r>
+        <w:rPr>
+          <w:rFonts w:ascii="Calibri" w:hAnsi="Calibri" w:eastAsia="Microsoft YaHei UI"/>
+          <w:b w:val="0"/>
+          <w:sz w:val="22"/>
+        </w:rPr>
+        <w:t>两条曲线使用同一范围和纵轴尺度。这是像素分布测量，不代表色彩质量评分。</w:t>
+      </w:r>
+    </w:p>
+    <w:p>
+      <w:pPr>
+        <w:pStyle w:val="Heading2"/>
+      </w:pPr>
+      <w:r>
+        <w:rPr>
+          <w:rFonts w:ascii="Calibri" w:hAnsi="Calibri" w:eastAsia="Microsoft YaHei UI"/>
+          <w:b/>
+          <w:color w:val="2E74B5"/>
+          <w:sz w:val="26"/>
+        </w:rPr>
         <w:t>三阶明度</w:t>
       </w:r>
     </w:p>
@@ -3865,7 +3957,7 @@
         <w:spacing w:before="0" w:after="80" w:line="300" w:lineRule="auto"/>
         <w:numPr>
           <w:ilvl w:val="0"/>
-          <w:numId w:val="25"/>
+          <w:numId w:val="26"/>
         </w:numPr>
       </w:pPr>
       <w:r>
@@ -3882,7 +3974,7 @@
         <w:spacing w:before="0" w:after="80" w:line="300" w:lineRule="auto"/>
         <w:numPr>
           <w:ilvl w:val="0"/>
-          <w:numId w:val="25"/>
+          <w:numId w:val="26"/>
         </w:numPr>
       </w:pPr>
       <w:r>
@@ -3899,7 +3991,7 @@
         <w:spacing w:before="0" w:after="80" w:line="300" w:lineRule="auto"/>
         <w:numPr>
           <w:ilvl w:val="0"/>
-          <w:numId w:val="25"/>
+          <w:numId w:val="26"/>
         </w:numPr>
       </w:pPr>
       <w:r>
@@ -3916,7 +4008,7 @@
         <w:spacing w:before="0" w:after="80" w:line="300" w:lineRule="auto"/>
         <w:numPr>
           <w:ilvl w:val="0"/>
-          <w:numId w:val="25"/>
+          <w:numId w:val="26"/>
         </w:numPr>
       </w:pPr>
       <w:r>
@@ -4039,7 +4131,7 @@
         <w:spacing w:before="0" w:after="80" w:line="300" w:lineRule="auto"/>
         <w:numPr>
           <w:ilvl w:val="0"/>
-          <w:numId w:val="26"/>
+          <w:numId w:val="27"/>
         </w:numPr>
       </w:pPr>
       <w:r>
@@ -4056,7 +4148,7 @@
         <w:spacing w:before="0" w:after="80" w:line="300" w:lineRule="auto"/>
         <w:numPr>
           <w:ilvl w:val="0"/>
-          <w:numId w:val="26"/>
+          <w:numId w:val="27"/>
         </w:numPr>
       </w:pPr>
       <w:r>
@@ -4073,7 +4165,7 @@
         <w:spacing w:before="0" w:after="80" w:line="300" w:lineRule="auto"/>
         <w:numPr>
           <w:ilvl w:val="0"/>
-          <w:numId w:val="26"/>
+          <w:numId w:val="27"/>
         </w:numPr>
       </w:pPr>
       <w:r>
@@ -4090,7 +4182,7 @@
         <w:spacing w:before="0" w:after="80" w:line="300" w:lineRule="auto"/>
         <w:numPr>
           <w:ilvl w:val="0"/>
-          <w:numId w:val="26"/>
+          <w:numId w:val="27"/>
         </w:numPr>
       </w:pPr>
       <w:r>
@@ -4107,7 +4199,7 @@
         <w:spacing w:before="0" w:after="80" w:line="300" w:lineRule="auto"/>
         <w:numPr>
           <w:ilvl w:val="0"/>
-          <w:numId w:val="26"/>
+          <w:numId w:val="27"/>
         </w:numPr>
       </w:pPr>
       <w:r>
@@ -4124,7 +4216,7 @@
         <w:spacing w:before="0" w:after="80" w:line="300" w:lineRule="auto"/>
         <w:numPr>
           <w:ilvl w:val="0"/>
-          <w:numId w:val="26"/>
+          <w:numId w:val="27"/>
         </w:numPr>
       </w:pPr>
       <w:r>
@@ -4134,6 +4226,23 @@
           <w:sz w:val="22"/>
         </w:rPr>
         <w:t>查看核心问题、证据支持或冲突，再由用户确认转为任务。</w:t>
+      </w:r>
+    </w:p>
+    <w:p>
+      <w:pPr>
+        <w:spacing w:before="0" w:after="80" w:line="300" w:lineRule="auto"/>
+        <w:numPr>
+          <w:ilvl w:val="0"/>
+          <w:numId w:val="27"/>
+        </w:numPr>
+      </w:pPr>
+      <w:r>
+        <w:rPr>
+          <w:rFonts w:ascii="Calibri" w:hAnsi="Calibri" w:eastAsia="Microsoft YaHei UI"/>
+          <w:b w:val="0"/>
+          <w:sz w:val="22"/>
+        </w:rPr>
+        <w:t>使用“历史记录”切换旧结果；新审阅完成后自动显示最新记录。</w:t>
       </w:r>
     </w:p>
     <w:p>
@@ -4256,7 +4365,7 @@
           <w:color w:val="2E74B5"/>
           <w:sz w:val="26"/>
         </w:rPr>
-        <w:t>AI 接口失败时</w:t>
+        <w:t>灯光专项审阅</w:t>
       </w:r>
     </w:p>
     <w:p>
@@ -4273,7 +4382,7 @@
           <w:b w:val="0"/>
           <w:sz w:val="22"/>
         </w:rPr>
-        <w:t>connection_closed：远端或中间网络设备提前断开连接，不表示 API Key 错误。新版会自动退避重试 3 次；仍失败时检查代理、VPN 和网络稳定性。</w:t>
+        <w:t>分为曝光与明度范围、主光与填充、焦点层级、空间分离、冷暖组织、 阴影与剪影、雾与体积效果、游戏可读性八个维度。</w:t>
       </w:r>
     </w:p>
     <w:p>
@@ -4290,7 +4399,7 @@
           <w:b w:val="0"/>
           <w:sz w:val="22"/>
         </w:rPr>
-        <w:t>自动重试可能重复提交同一请求并产生额外费用，发送确认窗口会提前提示。</w:t>
+        <w:t>每个维度分别说明目标、参考做法、当前效果、证据、已有优点、风险和不确定性。</w:t>
       </w:r>
     </w:p>
     <w:p>
@@ -4307,7 +4416,7 @@
           <w:b w:val="0"/>
           <w:sz w:val="22"/>
         </w:rPr>
-        <w:t>http_400：请求参数或模型不兼容。新版会自动处理 Gemini 深度审阅的复杂 Schema；仍失败时先确认正在运行 0.5.0a4，再恢复默认模型重试。</w:t>
+        <w:t>忠于参考、强化戏剧性和优先游戏可读性三套方案可查看完整策略、UE5.3 执行顺序、风险和验证方法。</w:t>
       </w:r>
     </w:p>
     <w:p>
@@ -4324,7 +4433,21 @@
           <w:b w:val="0"/>
           <w:sz w:val="22"/>
         </w:rPr>
-        <w:t>若错误包含 generation_config.response_format.text.mime_type，说明仍在运行 旧版；关闭旧程序后改用本次 Gemini 接口修正版。</w:t>
+        <w:t>没有 UE 工程参数时，性能部分只给检查清单，不伪造 Lux、EV、Actor 数量或性能收益。</w:t>
+      </w:r>
+    </w:p>
+    <w:p>
+      <w:pPr>
+        <w:pStyle w:val="Heading2"/>
+      </w:pPr>
+      <w:r>
+        <w:rPr>
+          <w:rFonts w:ascii="Calibri" w:hAnsi="Calibri" w:eastAsia="Microsoft YaHei UI"/>
+          <w:b/>
+          <w:color w:val="2E74B5"/>
+          <w:sz w:val="26"/>
+        </w:rPr>
+        <w:t>AI 审阅历史</w:t>
       </w:r>
     </w:p>
     <w:p>
@@ -4341,7 +4464,7 @@
           <w:b w:val="0"/>
           <w:sz w:val="22"/>
         </w:rPr>
-        <w:t>Gemini 首次返回的 JSON 语法损坏、被截断或结构不完整时，GATalk 最多 自动纠错一次。确认发送窗口会提示该过程可能再次发送同一审阅副本并增加 少量费用。</w:t>
+        <w:t>场景审阅按 Shot 和 Version 保存；作品研究和作品对照也会保存每次完成结果。</w:t>
       </w:r>
     </w:p>
     <w:p>
@@ -4358,7 +4481,7 @@
           <w:b w:val="0"/>
           <w:sz w:val="22"/>
         </w:rPr>
-        <w:t>finish_reason=MAX_TOKENS：AI 回答过长导致 JSON 尾部被截断，不表示 API Key 错误。新版会压缩内容，并只在明确截断时用更高预算纠错一次。</w:t>
+        <w:t>页面默认显示最新结果。选择历史记录可查看旧版，也可单独删除。</w:t>
       </w:r>
     </w:p>
     <w:p>
@@ -4375,7 +4498,21 @@
           <w:b w:val="0"/>
           <w:sz w:val="22"/>
         </w:rPr>
-        <w:t>错误中的 line 和 column 表示 AI 返回文本的 JSON 损坏位置，不表示 API Key 错误。0.5.0a4 会把原始返回交给同一模型压缩并修复；第二次仍损坏时 停止，不会无限重试。</w:t>
+        <w:t>删除审阅记录不会删除由用户已确认的任务、证据或个人笔记。</w:t>
+      </w:r>
+    </w:p>
+    <w:p>
+      <w:pPr>
+        <w:pStyle w:val="Heading2"/>
+      </w:pPr>
+      <w:r>
+        <w:rPr>
+          <w:rFonts w:ascii="Calibri" w:hAnsi="Calibri" w:eastAsia="Microsoft YaHei UI"/>
+          <w:b/>
+          <w:color w:val="2E74B5"/>
+          <w:sz w:val="26"/>
+        </w:rPr>
+        <w:t>AI 接口失败时</w:t>
       </w:r>
     </w:p>
     <w:p>
@@ -4392,7 +4529,7 @@
           <w:b w:val="0"/>
           <w:sz w:val="22"/>
         </w:rPr>
-        <w:t>若 AI 引用了本次报告中不存在的问题 ID，0.5.0a3 会取消无效链接并继续 显示完整报告，不追加 API 调用。界面的“结构修复”只表示链接已取消，正文 和真实问题没有被改写。</w:t>
+        <w:t>connection_closed：远端或中间网络设备提前断开连接，不表示 API Key 错误。新版会自动退避重试 3 次；仍失败时检查代理、VPN 和网络稳定性。</w:t>
       </w:r>
     </w:p>
     <w:p>
@@ -4409,7 +4546,7 @@
           <w:b w:val="0"/>
           <w:sz w:val="22"/>
         </w:rPr>
-        <w:t>http_401：Key 错误、过期或不属于该供应商。</w:t>
+        <w:t>自动重试可能重复提交同一请求并产生额外费用，发送确认窗口会提前提示。</w:t>
       </w:r>
     </w:p>
     <w:p>
@@ -4426,7 +4563,7 @@
           <w:b w:val="0"/>
           <w:sz w:val="22"/>
         </w:rPr>
-        <w:t>http_403：检查模型权限、服务开通、地域和 Key 所属工作区。</w:t>
+        <w:t>http_400：请求参数或模型不兼容。新版会自动处理 Gemini 深度审阅的复杂 Schema；仍失败时先确认正在运行 0.5.0a4，再恢复默认模型重试。</w:t>
       </w:r>
     </w:p>
     <w:p>
@@ -4443,7 +4580,7 @@
           <w:b w:val="0"/>
           <w:sz w:val="22"/>
         </w:rPr>
-        <w:t>http_404：模型 ID 已下线或接口不存在。Gemini 会按发送清单自动尝试 当前备用链；其他供应商请改回其默认模型。</w:t>
+        <w:t>若错误包含 generation_config.response_format.text.mime_type，说明仍在运行 旧版；关闭旧程序后改用本次 Gemini 接口修正版。</w:t>
       </w:r>
     </w:p>
     <w:p>
@@ -4460,7 +4597,7 @@
           <w:b w:val="0"/>
           <w:sz w:val="22"/>
         </w:rPr>
-        <w:t>http_413：降低发送分辨率后重试。</w:t>
+        <w:t>Gemini 首次返回的 JSON 语法损坏、被截断或结构不完整时，GATalk 最多 自动纠错一次。确认发送窗口会提示该过程可能再次发送同一审阅副本并增加 少量费用。</w:t>
       </w:r>
     </w:p>
     <w:p>
@@ -4477,7 +4614,7 @@
           <w:b w:val="0"/>
           <w:sz w:val="22"/>
         </w:rPr>
-        <w:t>http_429：额度不足或调用过快。</w:t>
+        <w:t>finish_reason=MAX_TOKENS：AI 回答过长导致 JSON 尾部被截断，不表示 API Key 错误。新版会压缩内容，并只在明确截断时用更高预算纠错一次。</w:t>
       </w:r>
     </w:p>
     <w:p>
@@ -4494,7 +4631,7 @@
           <w:b w:val="0"/>
           <w:sz w:val="22"/>
         </w:rPr>
-        <w:t>http_503：供应商当前模型临时过载，不表示 API Key 错误。新版先有限重试； Gemini 仍失败时会按发送清单依次尝试 gemini-3.5-flash 和 gemini-3.5-flash-lite，不会再使用 gemini-2.5-flash。</w:t>
+        <w:t>错误中的 line 和 column 表示 AI 返回文本的 JSON 损坏位置，不表示 API Key 错误。0.5.0a4 会把原始返回交给同一模型压缩并修复；第二次仍损坏时 停止，不会无限重试。</w:t>
       </w:r>
     </w:p>
     <w:p>
@@ -4511,7 +4648,7 @@
           <w:b w:val="0"/>
           <w:sz w:val="22"/>
         </w:rPr>
-        <w:t>发送清单会提前显示完整备用链。若发生回退，状态栏和保存记录会显示请求 模型、实际模型及回退原因；每次实际发送都可能产生调用费用。</w:t>
+        <w:t>若 AI 引用了本次报告中不存在的问题 ID，0.5.0a3 会取消无效链接并继续 显示完整报告，不追加 API 调用。界面的“结构修复”只表示链接已取消，正文 和真实问题没有被改写。</w:t>
       </w:r>
     </w:p>
     <w:p>
@@ -4528,45 +4665,7 @@
           <w:b w:val="0"/>
           <w:sz w:val="22"/>
         </w:rPr>
-        <w:t>其他 http_5xx：供应商服务异常，稍后重试。</w:t>
-      </w:r>
-    </w:p>
-    <w:p>
-      <w:r>
-        <w:rPr>
-          <w:rFonts w:ascii="Calibri" w:hAnsi="Calibri" w:eastAsia="Microsoft YaHei UI"/>
-          <w:b w:val="0"/>
-          <w:sz w:val="22"/>
-        </w:rPr>
-        <w:t>错误窗口只显示供应商返回的脱敏原因。不要把 API Key 截图或复制给他人。</w:t>
-      </w:r>
-    </w:p>
-    <w:p>
-      <w:pPr>
-        <w:pStyle w:val="Heading1"/>
-      </w:pPr>
-      <w:r>
-        <w:rPr>
-          <w:rFonts w:ascii="Calibri" w:hAnsi="Calibri" w:eastAsia="Microsoft YaHei UI"/>
-          <w:b/>
-          <w:color w:val="2E74B5"/>
-          <w:sz w:val="32"/>
-        </w:rPr>
-        <w:t>13. 优化实验室</w:t>
-      </w:r>
-    </w:p>
-    <w:p>
-      <w:pPr>
-        <w:pStyle w:val="Heading2"/>
-      </w:pPr>
-      <w:r>
-        <w:rPr>
-          <w:rFonts w:ascii="Calibri" w:hAnsi="Calibri" w:eastAsia="Microsoft YaHei UI"/>
-          <w:b/>
-          <w:color w:val="2E74B5"/>
-          <w:sz w:val="26"/>
-        </w:rPr>
-        <w:t>目标匹配画像</w:t>
+        <w:t>http_401：Key 错误、过期或不属于该供应商。</w:t>
       </w:r>
     </w:p>
     <w:p>
@@ -4583,7 +4682,7 @@
           <w:b w:val="0"/>
           <w:sz w:val="22"/>
         </w:rPr>
-        <w:t>显示明度、黑白灰、色板、彩度、冷暖、区域关系等维度。</w:t>
+        <w:t>http_403：检查模型权限、服务开通、地域和 Key 所属工作区。</w:t>
       </w:r>
     </w:p>
     <w:p>
@@ -4600,7 +4699,7 @@
           <w:b w:val="0"/>
           <w:sz w:val="22"/>
         </w:rPr>
-        <w:t>可修改各维度权重。</w:t>
+        <w:t>http_404：模型 ID 已下线或接口不存在。Gemini 会按发送清单自动尝试 当前备用链；其他供应商请改回其默认模型。</w:t>
       </w:r>
     </w:p>
     <w:p>
@@ -4617,7 +4716,7 @@
           <w:b w:val="0"/>
           <w:sz w:val="22"/>
         </w:rPr>
-        <w:t>“估计匹配度”只代表当前算法和权重，不是作品质量评分。</w:t>
+        <w:t>http_413：降低发送分辨率后重试。</w:t>
       </w:r>
     </w:p>
     <w:p>
@@ -4634,7 +4733,82 @@
           <w:b w:val="0"/>
           <w:sz w:val="22"/>
         </w:rPr>
-        <w:t>证据不足的维度会明确标出，不会自动猜测。</w:t>
+        <w:t>http_429：额度不足或调用过快。</w:t>
+      </w:r>
+    </w:p>
+    <w:p>
+      <w:pPr>
+        <w:spacing w:before="0" w:after="80" w:line="300" w:lineRule="auto"/>
+        <w:numPr>
+          <w:ilvl w:val="0"/>
+          <w:numId w:val="10"/>
+        </w:numPr>
+      </w:pPr>
+      <w:r>
+        <w:rPr>
+          <w:rFonts w:ascii="Calibri" w:hAnsi="Calibri" w:eastAsia="Microsoft YaHei UI"/>
+          <w:b w:val="0"/>
+          <w:sz w:val="22"/>
+        </w:rPr>
+        <w:t>http_503：供应商当前模型临时过载，不表示 API Key 错误。新版先有限重试； Gemini 仍失败时会按发送清单依次尝试 gemini-3.5-flash 和 gemini-3.5-flash-lite，不会再使用 gemini-2.5-flash。</w:t>
+      </w:r>
+    </w:p>
+    <w:p>
+      <w:pPr>
+        <w:spacing w:before="0" w:after="80" w:line="300" w:lineRule="auto"/>
+        <w:numPr>
+          <w:ilvl w:val="0"/>
+          <w:numId w:val="10"/>
+        </w:numPr>
+      </w:pPr>
+      <w:r>
+        <w:rPr>
+          <w:rFonts w:ascii="Calibri" w:hAnsi="Calibri" w:eastAsia="Microsoft YaHei UI"/>
+          <w:b w:val="0"/>
+          <w:sz w:val="22"/>
+        </w:rPr>
+        <w:t>发送清单会提前显示完整备用链。若发生回退，状态栏和保存记录会显示请求 模型、实际模型及回退原因；每次实际发送都可能产生调用费用。</w:t>
+      </w:r>
+    </w:p>
+    <w:p>
+      <w:pPr>
+        <w:spacing w:before="0" w:after="80" w:line="300" w:lineRule="auto"/>
+        <w:numPr>
+          <w:ilvl w:val="0"/>
+          <w:numId w:val="10"/>
+        </w:numPr>
+      </w:pPr>
+      <w:r>
+        <w:rPr>
+          <w:rFonts w:ascii="Calibri" w:hAnsi="Calibri" w:eastAsia="Microsoft YaHei UI"/>
+          <w:b w:val="0"/>
+          <w:sz w:val="22"/>
+        </w:rPr>
+        <w:t>其他 http_5xx：供应商服务异常，稍后重试。</w:t>
+      </w:r>
+    </w:p>
+    <w:p>
+      <w:r>
+        <w:rPr>
+          <w:rFonts w:ascii="Calibri" w:hAnsi="Calibri" w:eastAsia="Microsoft YaHei UI"/>
+          <w:b w:val="0"/>
+          <w:sz w:val="22"/>
+        </w:rPr>
+        <w:t>错误窗口只显示供应商返回的脱敏原因。不要把 API Key 截图或复制给他人。</w:t>
+      </w:r>
+    </w:p>
+    <w:p>
+      <w:pPr>
+        <w:pStyle w:val="Heading1"/>
+      </w:pPr>
+      <w:r>
+        <w:rPr>
+          <w:rFonts w:ascii="Calibri" w:hAnsi="Calibri" w:eastAsia="Microsoft YaHei UI"/>
+          <w:b/>
+          <w:color w:val="2E74B5"/>
+          <w:sz w:val="32"/>
+        </w:rPr>
+        <w:t>13. 优化实验室</w:t>
       </w:r>
     </w:p>
     <w:p>
@@ -4648,7 +4822,7 @@
           <w:color w:val="2E74B5"/>
           <w:sz w:val="26"/>
         </w:rPr>
-        <w:t>安全调色</w:t>
+        <w:t>目标匹配画像</w:t>
       </w:r>
     </w:p>
     <w:p>
@@ -4656,7 +4830,7 @@
         <w:spacing w:before="0" w:after="80" w:line="300" w:lineRule="auto"/>
         <w:numPr>
           <w:ilvl w:val="0"/>
-          <w:numId w:val="27"/>
+          <w:numId w:val="10"/>
         </w:numPr>
       </w:pPr>
       <w:r>
@@ -4665,7 +4839,7 @@
           <w:b w:val="0"/>
           <w:sz w:val="22"/>
         </w:rPr>
-        <w:t>调整曝光、对比、白平衡、阴影、中间调、亮部和彩度。</w:t>
+        <w:t>显示明度、黑白灰、色板、彩度、冷暖、区域关系等维度。</w:t>
       </w:r>
     </w:p>
     <w:p>
@@ -4673,7 +4847,7 @@
         <w:spacing w:before="0" w:after="80" w:line="300" w:lineRule="auto"/>
         <w:numPr>
           <w:ilvl w:val="0"/>
-          <w:numId w:val="27"/>
+          <w:numId w:val="10"/>
         </w:numPr>
       </w:pPr>
       <w:r>
@@ -4682,7 +4856,7 @@
           <w:b w:val="0"/>
           <w:sz w:val="22"/>
         </w:rPr>
-        <w:t>选择全图或当前选中的配对区域。</w:t>
+        <w:t>可修改各维度权重。</w:t>
       </w:r>
     </w:p>
     <w:p>
@@ -4690,7 +4864,7 @@
         <w:spacing w:before="0" w:after="80" w:line="300" w:lineRule="auto"/>
         <w:numPr>
           <w:ilvl w:val="0"/>
-          <w:numId w:val="27"/>
+          <w:numId w:val="10"/>
         </w:numPr>
       </w:pPr>
       <w:r>
@@ -4699,7 +4873,7 @@
           <w:b w:val="0"/>
           <w:sz w:val="22"/>
         </w:rPr>
-        <w:t>设置参考影响强度并生成预览。</w:t>
+        <w:t>“估计匹配度”只代表当前算法和权重，不是作品质量评分。</w:t>
       </w:r>
     </w:p>
     <w:p>
@@ -4707,7 +4881,7 @@
         <w:spacing w:before="0" w:after="80" w:line="300" w:lineRule="auto"/>
         <w:numPr>
           <w:ilvl w:val="0"/>
-          <w:numId w:val="27"/>
+          <w:numId w:val="10"/>
         </w:numPr>
       </w:pPr>
       <w:r>
@@ -4716,34 +4890,7 @@
           <w:b w:val="0"/>
           <w:sz w:val="22"/>
         </w:rPr>
-        <w:t>使用 A/B、撤销和重做检查结果。</w:t>
-      </w:r>
-    </w:p>
-    <w:p>
-      <w:pPr>
-        <w:spacing w:before="0" w:after="80" w:line="300" w:lineRule="auto"/>
-        <w:numPr>
-          <w:ilvl w:val="0"/>
-          <w:numId w:val="27"/>
-        </w:numPr>
-      </w:pPr>
-      <w:r>
-        <w:rPr>
-          <w:rFonts w:ascii="Calibri" w:hAnsi="Calibri" w:eastAsia="Microsoft YaHei UI"/>
-          <w:b w:val="0"/>
-          <w:sz w:val="22"/>
-        </w:rPr>
-        <w:t>可导出 PNG 和 JSON 配方；符合条件时可导出 .cube。</w:t>
-      </w:r>
-    </w:p>
-    <w:p>
-      <w:r>
-        <w:rPr>
-          <w:rFonts w:ascii="Calibri" w:hAnsi="Calibri" w:eastAsia="Microsoft YaHei UI"/>
-          <w:b w:val="0"/>
-          <w:sz w:val="22"/>
-        </w:rPr>
-        <w:t>安全调色完全本地运行，不修改原图。区域调色或参考色迁移不能导出通用 .cube。</w:t>
+        <w:t>证据不足的维度会明确标出，不会自动猜测。</w:t>
       </w:r>
     </w:p>
     <w:p>
@@ -4757,7 +4904,7 @@
           <w:color w:val="2E74B5"/>
           <w:sz w:val="26"/>
         </w:rPr>
-        <w:t>AI 优化预演</w:t>
+        <w:t>安全调色</w:t>
       </w:r>
     </w:p>
     <w:p>
@@ -4774,7 +4921,7 @@
           <w:b w:val="0"/>
           <w:sz w:val="22"/>
         </w:rPr>
-        <w:t>选择只改灯光、只改色彩或只改雾与氛围。</w:t>
+        <w:t>调整曝光、对比、白平衡、阴影、中间调、亮部和彩度。</w:t>
       </w:r>
     </w:p>
     <w:p>
@@ -4791,7 +4938,7 @@
           <w:b w:val="0"/>
           <w:sz w:val="22"/>
         </w:rPr>
-        <w:t>设置改动预算和构图、几何、资产身份保护项。</w:t>
+        <w:t>选择全图或当前选中的配对区域。</w:t>
       </w:r>
     </w:p>
     <w:p>
@@ -4808,7 +4955,7 @@
           <w:b w:val="0"/>
           <w:sz w:val="22"/>
         </w:rPr>
-        <w:t>查看发送清单并主动确认。</w:t>
+        <w:t>设置参考影响强度并生成预览。</w:t>
       </w:r>
     </w:p>
     <w:p>
@@ -4825,31 +4972,34 @@
           <w:b w:val="0"/>
           <w:sz w:val="22"/>
         </w:rPr>
-        <w:t>检查结构漂移、构图偏移和保护区变化。</w:t>
-      </w:r>
-    </w:p>
-    <w:p>
+        <w:t>使用 A/B、撤销和重做检查结果。</w:t>
+      </w:r>
+    </w:p>
+    <w:p>
+      <w:pPr>
+        <w:spacing w:before="0" w:after="80" w:line="300" w:lineRule="auto"/>
+        <w:numPr>
+          <w:ilvl w:val="0"/>
+          <w:numId w:val="28"/>
+        </w:numPr>
+      </w:pPr>
       <w:r>
         <w:rPr>
           <w:rFonts w:ascii="Calibri" w:hAnsi="Calibri" w:eastAsia="Microsoft YaHei UI"/>
           <w:b w:val="0"/>
           <w:sz w:val="22"/>
         </w:rPr>
-        <w:t>AI 输出只保存为 AIConceptPreview，不会成为真实 UE Version。出现“仅适合 概念参考”时，不应把预演当作可直接复现的场景结果。</w:t>
-      </w:r>
-    </w:p>
-    <w:p>
-      <w:pPr>
-        <w:pStyle w:val="Heading1"/>
-      </w:pPr>
-      <w:r>
-        <w:rPr>
-          <w:rFonts w:ascii="Calibri" w:hAnsi="Calibri" w:eastAsia="Microsoft YaHei UI"/>
-          <w:b/>
-          <w:color w:val="2E74B5"/>
-          <w:sz w:val="32"/>
-        </w:rPr>
-        <w:t>14. 全局工具与文件安全</w:t>
+        <w:t>可导出 PNG 和 JSON 配方；符合条件时可导出 .cube。</w:t>
+      </w:r>
+    </w:p>
+    <w:p>
+      <w:r>
+        <w:rPr>
+          <w:rFonts w:ascii="Calibri" w:hAnsi="Calibri" w:eastAsia="Microsoft YaHei UI"/>
+          <w:b w:val="0"/>
+          <w:sz w:val="22"/>
+        </w:rPr>
+        <w:t>安全调色完全本地运行，不修改原图。区域调色或参考色迁移不能导出通用 .cube。</w:t>
       </w:r>
     </w:p>
     <w:p>
@@ -4863,7 +5013,7 @@
           <w:color w:val="2E74B5"/>
           <w:sz w:val="26"/>
         </w:rPr>
-        <w:t>项目诊断与恢复</w:t>
+        <w:t>AI 优化预演</w:t>
       </w:r>
     </w:p>
     <w:p>
@@ -4880,7 +5030,7 @@
           <w:b w:val="0"/>
           <w:sz w:val="22"/>
         </w:rPr>
-        <w:t>在首页打开“项目诊断与恢复”。</w:t>
+        <w:t>选择只改灯光、只改色彩或只改雾与氛围。</w:t>
       </w:r>
     </w:p>
     <w:p>
@@ -4897,7 +5047,7 @@
           <w:b w:val="0"/>
           <w:sz w:val="22"/>
         </w:rPr>
-        <w:t>选择或扫描最近项目，查看入口、数据库、目录、资料引用、产物和写入状态。</w:t>
+        <w:t>设置改动预算和构图、几何、资产身份保护项。</w:t>
       </w:r>
     </w:p>
     <w:p>
@@ -4914,7 +5064,7 @@
           <w:b w:val="0"/>
           <w:sz w:val="22"/>
         </w:rPr>
-        <w:t>基础目录缺失时使用“修复项目目录”；该操作不会伪造数据库或原始资料。</w:t>
+        <w:t>查看发送清单并主动确认。</w:t>
       </w:r>
     </w:p>
     <w:p>
@@ -4931,7 +5081,45 @@
           <w:b w:val="0"/>
           <w:sz w:val="22"/>
         </w:rPr>
-        <w:t>重大修改前点击“建立恢复点”。需要回退时选择恢复点并确认恢复。</w:t>
+        <w:t>检查结构漂移、构图偏移和保护区变化。</w:t>
+      </w:r>
+    </w:p>
+    <w:p>
+      <w:r>
+        <w:rPr>
+          <w:rFonts w:ascii="Calibri" w:hAnsi="Calibri" w:eastAsia="Microsoft YaHei UI"/>
+          <w:b w:val="0"/>
+          <w:sz w:val="22"/>
+        </w:rPr>
+        <w:t>AI 输出只保存为 AIConceptPreview，不会成为真实 UE Version。出现“仅适合 概念参考”时，不应把预演当作可直接复现的场景结果。</w:t>
+      </w:r>
+    </w:p>
+    <w:p>
+      <w:pPr>
+        <w:pStyle w:val="Heading1"/>
+      </w:pPr>
+      <w:r>
+        <w:rPr>
+          <w:rFonts w:ascii="Calibri" w:hAnsi="Calibri" w:eastAsia="Microsoft YaHei UI"/>
+          <w:b/>
+          <w:color w:val="2E74B5"/>
+          <w:sz w:val="32"/>
+        </w:rPr>
+        <w:t>14. 全局工具与文件安全</w:t>
+      </w:r>
+    </w:p>
+    <w:p>
+      <w:pPr>
+        <w:pStyle w:val="Heading2"/>
+      </w:pPr>
+      <w:r>
+        <w:rPr>
+          <w:rFonts w:ascii="Calibri" w:hAnsi="Calibri" w:eastAsia="Microsoft YaHei UI"/>
+          <w:b/>
+          <w:color w:val="2E74B5"/>
+          <w:sz w:val="26"/>
+        </w:rPr>
+        <w:t>项目诊断与恢复</w:t>
       </w:r>
     </w:p>
     <w:p>
@@ -4939,7 +5127,7 @@
         <w:spacing w:before="0" w:after="80" w:line="300" w:lineRule="auto"/>
         <w:numPr>
           <w:ilvl w:val="0"/>
-          <w:numId w:val="29"/>
+          <w:numId w:val="30"/>
         </w:numPr>
       </w:pPr>
       <w:r>
@@ -4948,7 +5136,7 @@
           <w:b w:val="0"/>
           <w:sz w:val="22"/>
         </w:rPr>
-        <w:t>项目被移动后使用“重定位移动项目”，指向新的入口文件。</w:t>
+        <w:t>在首页打开“项目诊断与恢复”。</w:t>
       </w:r>
     </w:p>
     <w:p>
@@ -4956,7 +5144,75 @@
         <w:spacing w:before="0" w:after="80" w:line="300" w:lineRule="auto"/>
         <w:numPr>
           <w:ilvl w:val="0"/>
-          <w:numId w:val="29"/>
+          <w:numId w:val="30"/>
+        </w:numPr>
+      </w:pPr>
+      <w:r>
+        <w:rPr>
+          <w:rFonts w:ascii="Calibri" w:hAnsi="Calibri" w:eastAsia="Microsoft YaHei UI"/>
+          <w:b w:val="0"/>
+          <w:sz w:val="22"/>
+        </w:rPr>
+        <w:t>选择或扫描最近项目，查看入口、数据库、目录、资料引用、产物和写入状态。</w:t>
+      </w:r>
+    </w:p>
+    <w:p>
+      <w:pPr>
+        <w:spacing w:before="0" w:after="80" w:line="300" w:lineRule="auto"/>
+        <w:numPr>
+          <w:ilvl w:val="0"/>
+          <w:numId w:val="30"/>
+        </w:numPr>
+      </w:pPr>
+      <w:r>
+        <w:rPr>
+          <w:rFonts w:ascii="Calibri" w:hAnsi="Calibri" w:eastAsia="Microsoft YaHei UI"/>
+          <w:b w:val="0"/>
+          <w:sz w:val="22"/>
+        </w:rPr>
+        <w:t>基础目录缺失时使用“修复项目目录”；该操作不会伪造数据库或原始资料。</w:t>
+      </w:r>
+    </w:p>
+    <w:p>
+      <w:pPr>
+        <w:spacing w:before="0" w:after="80" w:line="300" w:lineRule="auto"/>
+        <w:numPr>
+          <w:ilvl w:val="0"/>
+          <w:numId w:val="30"/>
+        </w:numPr>
+      </w:pPr>
+      <w:r>
+        <w:rPr>
+          <w:rFonts w:ascii="Calibri" w:hAnsi="Calibri" w:eastAsia="Microsoft YaHei UI"/>
+          <w:b w:val="0"/>
+          <w:sz w:val="22"/>
+        </w:rPr>
+        <w:t>重大修改前点击“建立恢复点”。需要回退时选择恢复点并确认恢复。</w:t>
+      </w:r>
+    </w:p>
+    <w:p>
+      <w:pPr>
+        <w:spacing w:before="0" w:after="80" w:line="300" w:lineRule="auto"/>
+        <w:numPr>
+          <w:ilvl w:val="0"/>
+          <w:numId w:val="30"/>
+        </w:numPr>
+      </w:pPr>
+      <w:r>
+        <w:rPr>
+          <w:rFonts w:ascii="Calibri" w:hAnsi="Calibri" w:eastAsia="Microsoft YaHei UI"/>
+          <w:b w:val="0"/>
+          <w:sz w:val="22"/>
+        </w:rPr>
+        <w:t>项目被移动后使用“重定位移动项目”，指向新的入口文件。</w:t>
+      </w:r>
+    </w:p>
+    <w:p>
+      <w:pPr>
+        <w:spacing w:before="0" w:after="80" w:line="300" w:lineRule="auto"/>
+        <w:numPr>
+          <w:ilvl w:val="0"/>
+          <w:numId w:val="30"/>
         </w:numPr>
       </w:pPr>
       <w:r>
@@ -5988,6 +6244,24 @@
   </w:abstractNum>
   <w:num w:numId="29">
     <w:abstractNumId w:val="28"/>
+  </w:num>
+  <w:abstractNum w:abstractNumId="29">
+    <w:multiLevelType w:val="singleLevel"/>
+    <w:lvl w:ilvl="0">
+      <w:start w:val="1"/>
+      <w:numFmt w:val="decimal"/>
+      <w:lvlText w:val="%1."/>
+      <w:lvlJc w:val="left"/>
+      <w:pPr>
+        <w:tabs>
+          <w:tab w:val="num" w:pos="540"/>
+        </w:tabs>
+        <w:ind w:left="540" w:hanging="270"/>
+      </w:pPr>
+    </w:lvl>
+  </w:abstractNum>
+  <w:num w:numId="30">
+    <w:abstractNumId w:val="29"/>
   </w:num>
 </w:numbering>
 </file>

</xml_diff>

<commit_message>
feat: add persistent application localization
</commit_message>
<xml_diff>
--- a/GATalk_使用手册.docx
+++ b/GATalk_使用手册.docx
@@ -23,7 +23,7 @@
           <w:b w:val="0"/>
           <w:sz w:val="22"/>
         </w:rPr>
-        <w:t>适用版本：0.16.0（双图证据、灯光审片、AI 审阅历史与统一导航） 更新日期：2026-08-12</w:t>
+        <w:t>适用版本：0.17.0（全局语言系统） 更新日期：2026-08-12</w:t>
       </w:r>
     </w:p>
     <w:p>
@@ -245,7 +245,7 @@
           <w:color w:val="2E74B5"/>
           <w:sz w:val="26"/>
         </w:rPr>
-        <w:t>全局检索</w:t>
+        <w:t>切换界面语言</w:t>
       </w:r>
     </w:p>
     <w:p>
@@ -262,7 +262,7 @@
           <w:b w:val="0"/>
           <w:sz w:val="22"/>
         </w:rPr>
-        <w:t>在首页或任一工作区按 Ctrl+K。</w:t>
+        <w:t>打开“设置 &gt; 全局设置”，或按 Ctrl+,。</w:t>
       </w:r>
     </w:p>
     <w:p>
@@ -279,7 +279,7 @@
           <w:b w:val="0"/>
           <w:sz w:val="22"/>
         </w:rPr>
-        <w:t>输入项目、Shot、资料、作品研究、资产、生产规格、任务或门禁名称。</w:t>
+        <w:t>在“界面语言”选择语言。</w:t>
       </w:r>
     </w:p>
     <w:p>
@@ -296,31 +296,44 @@
           <w:b w:val="0"/>
           <w:sz w:val="22"/>
         </w:rPr>
-        <w:t>双击结果回到来源工作区和具体对象。</w:t>
-      </w:r>
-    </w:p>
-    <w:p>
+        <w:t>点击“应用”或“确定”。界面立即切换，以后启动继续使用该语言。</w:t>
+      </w:r>
+    </w:p>
+    <w:p>
+      <w:pPr>
+        <w:spacing w:before="0" w:after="80" w:line="300" w:lineRule="auto"/>
+        <w:numPr>
+          <w:ilvl w:val="0"/>
+          <w:numId w:val="11"/>
+        </w:numPr>
+      </w:pPr>
       <w:r>
         <w:rPr>
           <w:rFonts w:ascii="Calibri" w:hAnsi="Calibri" w:eastAsia="Microsoft YaHei UI"/>
           <w:b w:val="0"/>
           <w:sz w:val="22"/>
         </w:rPr>
-        <w:t>检索范围是已经在 GATalk 打开过的本地工作区。它不会扫描整块磁盘、访问网页 或上传索引。项目移动后先用“项目诊断与恢复”重定位。</w:t>
-      </w:r>
-    </w:p>
-    <w:p>
-      <w:pPr>
-        <w:pStyle w:val="Heading1"/>
-      </w:pPr>
-      <w:r>
-        <w:rPr>
-          <w:rFonts w:ascii="Calibri" w:hAnsi="Calibri" w:eastAsia="Microsoft YaHei UI"/>
-          <w:b/>
-          <w:color w:val="2E74B5"/>
-          <w:sz w:val="32"/>
-        </w:rPr>
-        <w:t>3. 参考资料与知识库</w:t>
+        <w:t>选择“跟随系统”时，GATalk 按 Windows 显示语言选择最接近的受支持语言。</w:t>
+      </w:r>
+    </w:p>
+    <w:p>
+      <w:r>
+        <w:rPr>
+          <w:rFonts w:ascii="Calibri" w:hAnsi="Calibri" w:eastAsia="Microsoft YaHei UI"/>
+          <w:b w:val="0"/>
+          <w:sz w:val="22"/>
+        </w:rPr>
+        <w:t>简体中文是完整基准语言。繁体中文、英语、日语和法语 当前标为“预览”；设置页会显示固定界面文案覆盖率和审校状态。没有译文的内容 回退为简体中文，不会显示空白。</w:t>
+      </w:r>
+    </w:p>
+    <w:p>
+      <w:r>
+        <w:rPr>
+          <w:rFonts w:ascii="Calibri" w:hAnsi="Calibri" w:eastAsia="Microsoft YaHei UI"/>
+          <w:b w:val="0"/>
+          <w:sz w:val="22"/>
+        </w:rPr>
+        <w:t>语言切换只作用于软件界面和之后新发起的 AI 输出要求。项目名、用户笔记、导入 资料和已有 AI 历史不会被自动翻译或改写。远程 AI 是否严格遵循语言要求仍取决于 供应商；保存的结果保留生成时原文。</w:t>
       </w:r>
     </w:p>
     <w:p>
@@ -334,7 +347,7 @@
           <w:color w:val="2E74B5"/>
           <w:sz w:val="26"/>
         </w:rPr>
-        <w:t>最短流程</w:t>
+        <w:t>全局检索</w:t>
       </w:r>
     </w:p>
     <w:p>
@@ -351,7 +364,7 @@
           <w:b w:val="0"/>
           <w:sz w:val="22"/>
         </w:rPr>
-        <w:t>在首页进入“参考资料与知识库”，新建或打开资料库目录。</w:t>
+        <w:t>在首页或任一工作区按 Ctrl+K。</w:t>
       </w:r>
     </w:p>
     <w:p>
@@ -368,7 +381,7 @@
           <w:b w:val="0"/>
           <w:sz w:val="22"/>
         </w:rPr>
-        <w:t>在左侧新建集合，例如“雾景”“建筑语言”或“灯光案例”。</w:t>
+        <w:t>输入项目、Shot、资料、作品研究、资产、生产规格、任务或门禁名称。</w:t>
       </w:r>
     </w:p>
     <w:p>
@@ -385,7 +398,45 @@
           <w:b w:val="0"/>
           <w:sz w:val="22"/>
         </w:rPr>
-        <w:t>导入原画或文档，添加 ArtStation、文章、教程链接，或新建项目笔记。</w:t>
+        <w:t>双击结果回到来源工作区和具体对象。</w:t>
+      </w:r>
+    </w:p>
+    <w:p>
+      <w:r>
+        <w:rPr>
+          <w:rFonts w:ascii="Calibri" w:hAnsi="Calibri" w:eastAsia="Microsoft YaHei UI"/>
+          <w:b w:val="0"/>
+          <w:sz w:val="22"/>
+        </w:rPr>
+        <w:t>检索范围是已经在 GATalk 打开过的本地工作区。它不会扫描整块磁盘、访问网页 或上传索引。项目移动后先用“项目诊断与恢复”重定位。</w:t>
+      </w:r>
+    </w:p>
+    <w:p>
+      <w:pPr>
+        <w:pStyle w:val="Heading1"/>
+      </w:pPr>
+      <w:r>
+        <w:rPr>
+          <w:rFonts w:ascii="Calibri" w:hAnsi="Calibri" w:eastAsia="Microsoft YaHei UI"/>
+          <w:b/>
+          <w:color w:val="2E74B5"/>
+          <w:sz w:val="32"/>
+        </w:rPr>
+        <w:t>3. 参考资料与知识库</w:t>
+      </w:r>
+    </w:p>
+    <w:p>
+      <w:pPr>
+        <w:pStyle w:val="Heading2"/>
+      </w:pPr>
+      <w:r>
+        <w:rPr>
+          <w:rFonts w:ascii="Calibri" w:hAnsi="Calibri" w:eastAsia="Microsoft YaHei UI"/>
+          <w:b/>
+          <w:color w:val="2E74B5"/>
+          <w:sz w:val="26"/>
+        </w:rPr>
+        <w:t>最短流程</w:t>
       </w:r>
     </w:p>
     <w:p>
@@ -393,7 +444,7 @@
         <w:spacing w:before="0" w:after="80" w:line="300" w:lineRule="auto"/>
         <w:numPr>
           <w:ilvl w:val="0"/>
-          <w:numId w:val="12"/>
+          <w:numId w:val="13"/>
         </w:numPr>
       </w:pPr>
       <w:r>
@@ -402,7 +453,7 @@
           <w:b w:val="0"/>
           <w:sz w:val="22"/>
         </w:rPr>
-        <w:t>在右侧填写来源类型、作者、项目、标签、资料说明和研究笔记，保存。</w:t>
+        <w:t>在首页进入“参考资料与知识库”，新建或打开资料库目录。</w:t>
       </w:r>
     </w:p>
     <w:p>
@@ -410,7 +461,7 @@
         <w:spacing w:before="0" w:after="80" w:line="300" w:lineRule="auto"/>
         <w:numPr>
           <w:ilvl w:val="0"/>
-          <w:numId w:val="12"/>
+          <w:numId w:val="13"/>
         </w:numPr>
       </w:pPr>
       <w:r>
@@ -419,7 +470,7 @@
           <w:b w:val="0"/>
           <w:sz w:val="22"/>
         </w:rPr>
-        <w:t>图片需要局部研究时点击“建立局部截图”，在原图上拖出范围并确认。</w:t>
+        <w:t>在左侧新建集合，例如“雾景”“建筑语言”或“灯光案例”。</w:t>
       </w:r>
     </w:p>
     <w:p>
@@ -427,7 +478,7 @@
         <w:spacing w:before="0" w:after="80" w:line="300" w:lineRule="auto"/>
         <w:numPr>
           <w:ilvl w:val="0"/>
-          <w:numId w:val="12"/>
+          <w:numId w:val="13"/>
         </w:numPr>
       </w:pPr>
       <w:r>
@@ -436,7 +487,7 @@
           <w:b w:val="0"/>
           <w:sz w:val="22"/>
         </w:rPr>
-        <w:t>需要翻译时粘贴原文，选择供应商，查看发送内容后主动确认；核对译文再保存。</w:t>
+        <w:t>导入原画或文档，添加 ArtStation、文章、教程链接，或新建项目笔记。</w:t>
       </w:r>
     </w:p>
     <w:p>
@@ -444,7 +495,7 @@
         <w:spacing w:before="0" w:after="80" w:line="300" w:lineRule="auto"/>
         <w:numPr>
           <w:ilvl w:val="0"/>
-          <w:numId w:val="12"/>
+          <w:numId w:val="13"/>
         </w:numPr>
       </w:pPr>
       <w:r>
@@ -453,7 +504,7 @@
           <w:b w:val="0"/>
           <w:sz w:val="22"/>
         </w:rPr>
-        <w:t>点击“引用到项目”，选择场景审阅、作品研究、作品对照或资产拆分项目目录。</w:t>
+        <w:t>在右侧填写来源类型、作者、项目、标签、资料说明和研究笔记，保存。</w:t>
       </w:r>
     </w:p>
     <w:p>
@@ -461,7 +512,7 @@
         <w:spacing w:before="0" w:after="80" w:line="300" w:lineRule="auto"/>
         <w:numPr>
           <w:ilvl w:val="0"/>
-          <w:numId w:val="12"/>
+          <w:numId w:val="13"/>
         </w:numPr>
       </w:pPr>
       <w:r>
@@ -470,7 +521,7 @@
           <w:b w:val="0"/>
           <w:sz w:val="22"/>
         </w:rPr>
-        <w:t>用搜索框按标题、作者、项目、标签、笔记、原文和译文筛选。</w:t>
+        <w:t>图片需要局部研究时点击“建立局部截图”，在原图上拖出范围并确认。</w:t>
       </w:r>
     </w:p>
     <w:p>
@@ -478,7 +529,7 @@
         <w:spacing w:before="0" w:after="80" w:line="300" w:lineRule="auto"/>
         <w:numPr>
           <w:ilvl w:val="0"/>
-          <w:numId w:val="12"/>
+          <w:numId w:val="13"/>
         </w:numPr>
       </w:pPr>
       <w:r>
@@ -487,7 +538,7 @@
           <w:b w:val="0"/>
           <w:sz w:val="22"/>
         </w:rPr>
-        <w:t>按 Shift 或 Ctrl 多选 2 至 6 张图片，点击“建立对照研究”。</w:t>
+        <w:t>需要翻译时粘贴原文，选择供应商，查看发送内容后主动确认；核对译文再保存。</w:t>
       </w:r>
     </w:p>
     <w:p>
@@ -495,7 +546,58 @@
         <w:spacing w:before="0" w:after="80" w:line="300" w:lineRule="auto"/>
         <w:numPr>
           <w:ilvl w:val="0"/>
-          <w:numId w:val="12"/>
+          <w:numId w:val="13"/>
+        </w:numPr>
+      </w:pPr>
+      <w:r>
+        <w:rPr>
+          <w:rFonts w:ascii="Calibri" w:hAnsi="Calibri" w:eastAsia="Microsoft YaHei UI"/>
+          <w:b w:val="0"/>
+          <w:sz w:val="22"/>
+        </w:rPr>
+        <w:t>点击“引用到项目”，选择场景审阅、作品研究、作品对照或资产拆分项目目录。</w:t>
+      </w:r>
+    </w:p>
+    <w:p>
+      <w:pPr>
+        <w:spacing w:before="0" w:after="80" w:line="300" w:lineRule="auto"/>
+        <w:numPr>
+          <w:ilvl w:val="0"/>
+          <w:numId w:val="13"/>
+        </w:numPr>
+      </w:pPr>
+      <w:r>
+        <w:rPr>
+          <w:rFonts w:ascii="Calibri" w:hAnsi="Calibri" w:eastAsia="Microsoft YaHei UI"/>
+          <w:b w:val="0"/>
+          <w:sz w:val="22"/>
+        </w:rPr>
+        <w:t>用搜索框按标题、作者、项目、标签、笔记、原文和译文筛选。</w:t>
+      </w:r>
+    </w:p>
+    <w:p>
+      <w:pPr>
+        <w:spacing w:before="0" w:after="80" w:line="300" w:lineRule="auto"/>
+        <w:numPr>
+          <w:ilvl w:val="0"/>
+          <w:numId w:val="13"/>
+        </w:numPr>
+      </w:pPr>
+      <w:r>
+        <w:rPr>
+          <w:rFonts w:ascii="Calibri" w:hAnsi="Calibri" w:eastAsia="Microsoft YaHei UI"/>
+          <w:b w:val="0"/>
+          <w:sz w:val="22"/>
+        </w:rPr>
+        <w:t>按 Shift 或 Ctrl 多选 2 至 6 张图片，点击“建立对照研究”。</w:t>
+      </w:r>
+    </w:p>
+    <w:p>
+      <w:pPr>
+        <w:spacing w:before="0" w:after="80" w:line="300" w:lineRule="auto"/>
+        <w:numPr>
+          <w:ilvl w:val="0"/>
+          <w:numId w:val="13"/>
         </w:numPr>
       </w:pPr>
       <w:r>
@@ -679,7 +781,7 @@
         <w:spacing w:before="0" w:after="80" w:line="300" w:lineRule="auto"/>
         <w:numPr>
           <w:ilvl w:val="0"/>
-          <w:numId w:val="13"/>
+          <w:numId w:val="14"/>
         </w:numPr>
       </w:pPr>
       <w:r>
@@ -689,112 +791,6 @@
           <w:sz w:val="22"/>
         </w:rPr>
         <w:t>选择资料后打开视觉资料板；也可以先打开空白资料板。</w:t>
-      </w:r>
-    </w:p>
-    <w:p>
-      <w:pPr>
-        <w:spacing w:before="0" w:after="80" w:line="300" w:lineRule="auto"/>
-        <w:numPr>
-          <w:ilvl w:val="0"/>
-          <w:numId w:val="13"/>
-        </w:numPr>
-      </w:pPr>
-      <w:r>
-        <w:rPr>
-          <w:rFonts w:ascii="Calibri" w:hAnsi="Calibri" w:eastAsia="Microsoft YaHei UI"/>
-          <w:b w:val="0"/>
-          <w:sz w:val="22"/>
-        </w:rPr>
-        <w:t>添加资料卡或文字卡并拖动排列；按 Shift 多选，拖框可批量选择。</w:t>
-      </w:r>
-    </w:p>
-    <w:p>
-      <w:pPr>
-        <w:spacing w:before="0" w:after="80" w:line="300" w:lineRule="auto"/>
-        <w:numPr>
-          <w:ilvl w:val="0"/>
-          <w:numId w:val="13"/>
-        </w:numPr>
-      </w:pPr>
-      <w:r>
-        <w:rPr>
-          <w:rFonts w:ascii="Calibri" w:hAnsi="Calibri" w:eastAsia="Microsoft YaHei UI"/>
-          <w:b w:val="0"/>
-          <w:sz w:val="22"/>
-        </w:rPr>
-        <w:t>选择两张卡片后建立连线；需要整齐布局时使用“网格排列”。</w:t>
-      </w:r>
-    </w:p>
-    <w:p>
-      <w:pPr>
-        <w:spacing w:before="0" w:after="80" w:line="300" w:lineRule="auto"/>
-        <w:numPr>
-          <w:ilvl w:val="0"/>
-          <w:numId w:val="13"/>
-        </w:numPr>
-      </w:pPr>
-      <w:r>
-        <w:rPr>
-          <w:rFonts w:ascii="Calibri" w:hAnsi="Calibri" w:eastAsia="Microsoft YaHei UI"/>
-          <w:b w:val="0"/>
-          <w:sz w:val="22"/>
-        </w:rPr>
-        <w:t>关键阶段建立快照。误改后选择快照恢复。</w:t>
-      </w:r>
-    </w:p>
-    <w:p>
-      <w:pPr>
-        <w:spacing w:before="0" w:after="80" w:line="300" w:lineRule="auto"/>
-        <w:numPr>
-          <w:ilvl w:val="0"/>
-          <w:numId w:val="13"/>
-        </w:numPr>
-      </w:pPr>
-      <w:r>
-        <w:rPr>
-          <w:rFonts w:ascii="Calibri" w:hAnsi="Calibri" w:eastAsia="Microsoft YaHei UI"/>
-          <w:b w:val="0"/>
-          <w:sz w:val="22"/>
-        </w:rPr>
-        <w:t>使用“导出 PNG”生成分享图；结构化资料板仍随资料库保存。</w:t>
-      </w:r>
-    </w:p>
-    <w:p>
-      <w:r>
-        <w:rPr>
-          <w:rFonts w:ascii="Calibri" w:hAnsi="Calibri" w:eastAsia="Microsoft YaHei UI"/>
-          <w:b w:val="0"/>
-          <w:sz w:val="22"/>
-        </w:rPr>
-        <w:t>Ctrl+鼠标滚轮 缩放，Delete 删除所选卡片，Ctrl+S 保存。删除资料库条目 会同步清理资料板中的引用卡片和失效连线，不修改原始图片。</w:t>
-      </w:r>
-    </w:p>
-    <w:p>
-      <w:pPr>
-        <w:pStyle w:val="Heading1"/>
-      </w:pPr>
-      <w:r>
-        <w:rPr>
-          <w:rFonts w:ascii="Calibri" w:hAnsi="Calibri" w:eastAsia="Microsoft YaHei UI"/>
-          <w:b/>
-          <w:color w:val="2E74B5"/>
-          <w:sz w:val="32"/>
-        </w:rPr>
-        <w:t>4. 作品研究集合与对照研究</w:t>
-      </w:r>
-    </w:p>
-    <w:p>
-      <w:pPr>
-        <w:pStyle w:val="Heading2"/>
-      </w:pPr>
-      <w:r>
-        <w:rPr>
-          <w:rFonts w:ascii="Calibri" w:hAnsi="Calibri" w:eastAsia="Microsoft YaHei UI"/>
-          <w:b/>
-          <w:color w:val="2E74B5"/>
-          <w:sz w:val="26"/>
-        </w:rPr>
-        <w:t>最短流程</w:t>
       </w:r>
     </w:p>
     <w:p>
@@ -811,7 +807,7 @@
           <w:b w:val="0"/>
           <w:sz w:val="22"/>
         </w:rPr>
-        <w:t>从资料库选择图片建立研究，或在首页直接进入并新建项目。</w:t>
+        <w:t>添加资料卡或文字卡并拖动排列；按 Shift 多选，拖框可批量选择。</w:t>
       </w:r>
     </w:p>
     <w:p>
@@ -828,7 +824,7 @@
           <w:b w:val="0"/>
           <w:sz w:val="22"/>
         </w:rPr>
-        <w:t>输入核心研究问题和已核实背景。</w:t>
+        <w:t>选择两张卡片后建立连线；需要整齐布局时使用“网格排列”。</w:t>
       </w:r>
     </w:p>
     <w:p>
@@ -845,7 +841,7 @@
           <w:b w:val="0"/>
           <w:sz w:val="22"/>
         </w:rPr>
-        <w:t>勾选 2 至 6 件作品，并选择构图、层级、明度、色彩、灯光、空间等比较维度。</w:t>
+        <w:t>关键阶段建立快照。误改后选择快照恢复。</w:t>
       </w:r>
     </w:p>
     <w:p>
@@ -862,7 +858,45 @@
           <w:b w:val="0"/>
           <w:sz w:val="22"/>
         </w:rPr>
-        <w:t>点击“运行本地对照”，查看双方明度、黑白灰、饱和度、中性色和细节密度差异。</w:t>
+        <w:t>使用“导出 PNG”生成分享图；结构化资料板仍随资料库保存。</w:t>
+      </w:r>
+    </w:p>
+    <w:p>
+      <w:r>
+        <w:rPr>
+          <w:rFonts w:ascii="Calibri" w:hAnsi="Calibri" w:eastAsia="Microsoft YaHei UI"/>
+          <w:b w:val="0"/>
+          <w:sz w:val="22"/>
+        </w:rPr>
+        <w:t>Ctrl+鼠标滚轮 缩放，Delete 删除所选卡片，Ctrl+S 保存。删除资料库条目 会同步清理资料板中的引用卡片和失效连线，不修改原始图片。</w:t>
+      </w:r>
+    </w:p>
+    <w:p>
+      <w:pPr>
+        <w:pStyle w:val="Heading1"/>
+      </w:pPr>
+      <w:r>
+        <w:rPr>
+          <w:rFonts w:ascii="Calibri" w:hAnsi="Calibri" w:eastAsia="Microsoft YaHei UI"/>
+          <w:b/>
+          <w:color w:val="2E74B5"/>
+          <w:sz w:val="32"/>
+        </w:rPr>
+        <w:t>4. 作品研究集合与对照研究</w:t>
+      </w:r>
+    </w:p>
+    <w:p>
+      <w:pPr>
+        <w:pStyle w:val="Heading2"/>
+      </w:pPr>
+      <w:r>
+        <w:rPr>
+          <w:rFonts w:ascii="Calibri" w:hAnsi="Calibri" w:eastAsia="Microsoft YaHei UI"/>
+          <w:b/>
+          <w:color w:val="2E74B5"/>
+          <w:sz w:val="26"/>
+        </w:rPr>
+        <w:t>最短流程</w:t>
       </w:r>
     </w:p>
     <w:p>
@@ -870,7 +904,7 @@
         <w:spacing w:before="0" w:after="80" w:line="300" w:lineRule="auto"/>
         <w:numPr>
           <w:ilvl w:val="0"/>
-          <w:numId w:val="14"/>
+          <w:numId w:val="15"/>
         </w:numPr>
       </w:pPr>
       <w:r>
@@ -879,7 +913,7 @@
           <w:b w:val="0"/>
           <w:sz w:val="22"/>
         </w:rPr>
-        <w:t>在“专家对照”选择 AI 供应商，查看发送清单并主动确认。</w:t>
+        <w:t>从资料库选择图片建立研究，或在首页直接进入并新建项目。</w:t>
       </w:r>
     </w:p>
     <w:p>
@@ -887,7 +921,7 @@
         <w:spacing w:before="0" w:after="80" w:line="300" w:lineRule="auto"/>
         <w:numPr>
           <w:ilvl w:val="0"/>
-          <w:numId w:val="14"/>
+          <w:numId w:val="15"/>
         </w:numPr>
       </w:pPr>
       <w:r>
@@ -896,7 +930,7 @@
           <w:b w:val="0"/>
           <w:sz w:val="22"/>
         </w:rPr>
-        <w:t>阅读逐件策略、逐轴共同点与差异、跨维度关系、可迁移规律和研究边界。</w:t>
+        <w:t>输入核心研究问题和已核实背景。</w:t>
       </w:r>
     </w:p>
     <w:p>
@@ -904,7 +938,75 @@
         <w:spacing w:before="0" w:after="80" w:line="300" w:lineRule="auto"/>
         <w:numPr>
           <w:ilvl w:val="0"/>
-          <w:numId w:val="14"/>
+          <w:numId w:val="15"/>
+        </w:numPr>
+      </w:pPr>
+      <w:r>
+        <w:rPr>
+          <w:rFonts w:ascii="Calibri" w:hAnsi="Calibri" w:eastAsia="Microsoft YaHei UI"/>
+          <w:b w:val="0"/>
+          <w:sz w:val="22"/>
+        </w:rPr>
+        <w:t>勾选 2 至 6 件作品，并选择构图、层级、明度、色彩、灯光、空间等比较维度。</w:t>
+      </w:r>
+    </w:p>
+    <w:p>
+      <w:pPr>
+        <w:spacing w:before="0" w:after="80" w:line="300" w:lineRule="auto"/>
+        <w:numPr>
+          <w:ilvl w:val="0"/>
+          <w:numId w:val="15"/>
+        </w:numPr>
+      </w:pPr>
+      <w:r>
+        <w:rPr>
+          <w:rFonts w:ascii="Calibri" w:hAnsi="Calibri" w:eastAsia="Microsoft YaHei UI"/>
+          <w:b w:val="0"/>
+          <w:sz w:val="22"/>
+        </w:rPr>
+        <w:t>点击“运行本地对照”，查看双方明度、黑白灰、饱和度、中性色和细节密度差异。</w:t>
+      </w:r>
+    </w:p>
+    <w:p>
+      <w:pPr>
+        <w:spacing w:before="0" w:after="80" w:line="300" w:lineRule="auto"/>
+        <w:numPr>
+          <w:ilvl w:val="0"/>
+          <w:numId w:val="15"/>
+        </w:numPr>
+      </w:pPr>
+      <w:r>
+        <w:rPr>
+          <w:rFonts w:ascii="Calibri" w:hAnsi="Calibri" w:eastAsia="Microsoft YaHei UI"/>
+          <w:b w:val="0"/>
+          <w:sz w:val="22"/>
+        </w:rPr>
+        <w:t>在“专家对照”选择 AI 供应商，查看发送清单并主动确认。</w:t>
+      </w:r>
+    </w:p>
+    <w:p>
+      <w:pPr>
+        <w:spacing w:before="0" w:after="80" w:line="300" w:lineRule="auto"/>
+        <w:numPr>
+          <w:ilvl w:val="0"/>
+          <w:numId w:val="15"/>
+        </w:numPr>
+      </w:pPr>
+      <w:r>
+        <w:rPr>
+          <w:rFonts w:ascii="Calibri" w:hAnsi="Calibri" w:eastAsia="Microsoft YaHei UI"/>
+          <w:b w:val="0"/>
+          <w:sz w:val="22"/>
+        </w:rPr>
+        <w:t>阅读逐件策略、逐轴共同点与差异、跨维度关系、可迁移规律和研究边界。</w:t>
+      </w:r>
+    </w:p>
+    <w:p>
+      <w:pPr>
+        <w:spacing w:before="0" w:after="80" w:line="300" w:lineRule="auto"/>
+        <w:numPr>
+          <w:ilvl w:val="0"/>
+          <w:numId w:val="15"/>
         </w:numPr>
       </w:pPr>
       <w:r>
@@ -1034,7 +1136,7 @@
         <w:spacing w:before="0" w:after="80" w:line="300" w:lineRule="auto"/>
         <w:numPr>
           <w:ilvl w:val="0"/>
-          <w:numId w:val="15"/>
+          <w:numId w:val="16"/>
         </w:numPr>
       </w:pPr>
       <w:r>
@@ -1044,115 +1146,6 @@
           <w:sz w:val="22"/>
         </w:rPr>
         <w:t>在场景美术控制中确认审阅发现或优化预演任务；在作品研究中选中一个研究 维度；在资产拆分中选择一项或多项资产。</w:t>
-      </w:r>
-    </w:p>
-    <w:p>
-      <w:pPr>
-        <w:spacing w:before="0" w:after="80" w:line="300" w:lineRule="auto"/>
-        <w:numPr>
-          <w:ilvl w:val="0"/>
-          <w:numId w:val="15"/>
-        </w:numPr>
-      </w:pPr>
-      <w:r>
-        <w:rPr>
-          <w:rFonts w:ascii="Calibri" w:hAnsi="Calibri" w:eastAsia="Microsoft YaHei UI"/>
-          <w:b w:val="0"/>
-          <w:sz w:val="22"/>
-        </w:rPr>
-        <w:t>点击“加入审阅中心”。只有用户主动选择的内容会进入中心。</w:t>
-      </w:r>
-    </w:p>
-    <w:p>
-      <w:pPr>
-        <w:spacing w:before="0" w:after="80" w:line="300" w:lineRule="auto"/>
-        <w:numPr>
-          <w:ilvl w:val="0"/>
-          <w:numId w:val="15"/>
-        </w:numPr>
-      </w:pPr>
-      <w:r>
-        <w:rPr>
-          <w:rFonts w:ascii="Calibri" w:hAnsi="Calibri" w:eastAsia="Microsoft YaHei UI"/>
-          <w:b w:val="0"/>
-          <w:sz w:val="22"/>
-        </w:rPr>
-        <w:t>返回工作台首页，进入“审阅任务与质量门禁中心”。</w:t>
-      </w:r>
-    </w:p>
-    <w:p>
-      <w:pPr>
-        <w:spacing w:before="0" w:after="80" w:line="300" w:lineRule="auto"/>
-        <w:numPr>
-          <w:ilvl w:val="0"/>
-          <w:numId w:val="15"/>
-        </w:numPr>
-      </w:pPr>
-      <w:r>
-        <w:rPr>
-          <w:rFonts w:ascii="Calibri" w:hAnsi="Calibri" w:eastAsia="Microsoft YaHei UI"/>
-          <w:b w:val="0"/>
-          <w:sz w:val="22"/>
-        </w:rPr>
-        <w:t>检查来源项目、来源对象和来源版本，补充处理说明和可验证的验收条件。</w:t>
-      </w:r>
-    </w:p>
-    <w:p>
-      <w:pPr>
-        <w:spacing w:before="0" w:after="80" w:line="300" w:lineRule="auto"/>
-        <w:numPr>
-          <w:ilvl w:val="0"/>
-          <w:numId w:val="15"/>
-        </w:numPr>
-      </w:pPr>
-      <w:r>
-        <w:rPr>
-          <w:rFonts w:ascii="Calibri" w:hAnsi="Calibri" w:eastAsia="Microsoft YaHei UI"/>
-          <w:b w:val="0"/>
-          <w:sz w:val="22"/>
-        </w:rPr>
-        <w:t>设置优先级和状态并保存。</w:t>
-      </w:r>
-    </w:p>
-    <w:p>
-      <w:pPr>
-        <w:spacing w:before="0" w:after="80" w:line="300" w:lineRule="auto"/>
-        <w:numPr>
-          <w:ilvl w:val="0"/>
-          <w:numId w:val="15"/>
-        </w:numPr>
-      </w:pPr>
-      <w:r>
-        <w:rPr>
-          <w:rFonts w:ascii="Calibri" w:hAnsi="Calibri" w:eastAsia="Microsoft YaHei UI"/>
-          <w:b w:val="0"/>
-          <w:sz w:val="22"/>
-        </w:rPr>
-        <w:t>需要时指定制作阶段、截止日期和前置任务。</w:t>
-      </w:r>
-    </w:p>
-    <w:p>
-      <w:r>
-        <w:rPr>
-          <w:rFonts w:ascii="Calibri" w:hAnsi="Calibri" w:eastAsia="Microsoft YaHei UI"/>
-          <w:b w:val="0"/>
-          <w:sz w:val="22"/>
-        </w:rPr>
-        <w:t>重复加入同一个来源对象时不会建立第二条任务。审阅中心不复制原图，也不会 反向修改来源项目；删除中心任务不会删除专业项目中的分析或资产。</w:t>
-      </w:r>
-    </w:p>
-    <w:p>
-      <w:pPr>
-        <w:pStyle w:val="Heading2"/>
-      </w:pPr>
-      <w:r>
-        <w:rPr>
-          <w:rFonts w:ascii="Calibri" w:hAnsi="Calibri" w:eastAsia="Microsoft YaHei UI"/>
-          <w:b/>
-          <w:color w:val="2E74B5"/>
-          <w:sz w:val="26"/>
-        </w:rPr>
-        <w:t>按版本复查任务</w:t>
       </w:r>
     </w:p>
     <w:p>
@@ -1169,7 +1162,7 @@
           <w:b w:val="0"/>
           <w:sz w:val="22"/>
         </w:rPr>
-        <w:t>选择任务，点击“记录新版本复查”。</w:t>
+        <w:t>点击“加入审阅中心”。只有用户主动选择的内容会进入中心。</w:t>
       </w:r>
     </w:p>
     <w:p>
@@ -1186,7 +1179,7 @@
           <w:b w:val="0"/>
           <w:sz w:val="22"/>
         </w:rPr>
-        <w:t>填写版本名称和可选版本 ID。</w:t>
+        <w:t>返回工作台首页，进入“审阅任务与质量门禁中心”。</w:t>
       </w:r>
     </w:p>
     <w:p>
@@ -1203,7 +1196,7 @@
           <w:b w:val="0"/>
           <w:sz w:val="22"/>
         </w:rPr>
-        <w:t>选择“已改善、无明显变化、进一步偏离、已解决”或“证据不足”。</w:t>
+        <w:t>检查来源项目、来源对象和来源版本，补充处理说明和可验证的验收条件。</w:t>
       </w:r>
     </w:p>
     <w:p>
@@ -1220,7 +1213,7 @@
           <w:b w:val="0"/>
           <w:sz w:val="22"/>
         </w:rPr>
-        <w:t>写明本次判断使用的画面或测量证据并保存。</w:t>
+        <w:t>设置优先级和状态并保存。</w:t>
       </w:r>
     </w:p>
     <w:p>
@@ -1237,6 +1230,115 @@
           <w:b w:val="0"/>
           <w:sz w:val="22"/>
         </w:rPr>
+        <w:t>需要时指定制作阶段、截止日期和前置任务。</w:t>
+      </w:r>
+    </w:p>
+    <w:p>
+      <w:r>
+        <w:rPr>
+          <w:rFonts w:ascii="Calibri" w:hAnsi="Calibri" w:eastAsia="Microsoft YaHei UI"/>
+          <w:b w:val="0"/>
+          <w:sz w:val="22"/>
+        </w:rPr>
+        <w:t>重复加入同一个来源对象时不会建立第二条任务。审阅中心不复制原图，也不会 反向修改来源项目；删除中心任务不会删除专业项目中的分析或资产。</w:t>
+      </w:r>
+    </w:p>
+    <w:p>
+      <w:pPr>
+        <w:pStyle w:val="Heading2"/>
+      </w:pPr>
+      <w:r>
+        <w:rPr>
+          <w:rFonts w:ascii="Calibri" w:hAnsi="Calibri" w:eastAsia="Microsoft YaHei UI"/>
+          <w:b/>
+          <w:color w:val="2E74B5"/>
+          <w:sz w:val="26"/>
+        </w:rPr>
+        <w:t>按版本复查任务</w:t>
+      </w:r>
+    </w:p>
+    <w:p>
+      <w:pPr>
+        <w:spacing w:before="0" w:after="80" w:line="300" w:lineRule="auto"/>
+        <w:numPr>
+          <w:ilvl w:val="0"/>
+          <w:numId w:val="17"/>
+        </w:numPr>
+      </w:pPr>
+      <w:r>
+        <w:rPr>
+          <w:rFonts w:ascii="Calibri" w:hAnsi="Calibri" w:eastAsia="Microsoft YaHei UI"/>
+          <w:b w:val="0"/>
+          <w:sz w:val="22"/>
+        </w:rPr>
+        <w:t>选择任务，点击“记录新版本复查”。</w:t>
+      </w:r>
+    </w:p>
+    <w:p>
+      <w:pPr>
+        <w:spacing w:before="0" w:after="80" w:line="300" w:lineRule="auto"/>
+        <w:numPr>
+          <w:ilvl w:val="0"/>
+          <w:numId w:val="17"/>
+        </w:numPr>
+      </w:pPr>
+      <w:r>
+        <w:rPr>
+          <w:rFonts w:ascii="Calibri" w:hAnsi="Calibri" w:eastAsia="Microsoft YaHei UI"/>
+          <w:b w:val="0"/>
+          <w:sz w:val="22"/>
+        </w:rPr>
+        <w:t>填写版本名称和可选版本 ID。</w:t>
+      </w:r>
+    </w:p>
+    <w:p>
+      <w:pPr>
+        <w:spacing w:before="0" w:after="80" w:line="300" w:lineRule="auto"/>
+        <w:numPr>
+          <w:ilvl w:val="0"/>
+          <w:numId w:val="17"/>
+        </w:numPr>
+      </w:pPr>
+      <w:r>
+        <w:rPr>
+          <w:rFonts w:ascii="Calibri" w:hAnsi="Calibri" w:eastAsia="Microsoft YaHei UI"/>
+          <w:b w:val="0"/>
+          <w:sz w:val="22"/>
+        </w:rPr>
+        <w:t>选择“已改善、无明显变化、进一步偏离、已解决”或“证据不足”。</w:t>
+      </w:r>
+    </w:p>
+    <w:p>
+      <w:pPr>
+        <w:spacing w:before="0" w:after="80" w:line="300" w:lineRule="auto"/>
+        <w:numPr>
+          <w:ilvl w:val="0"/>
+          <w:numId w:val="17"/>
+        </w:numPr>
+      </w:pPr>
+      <w:r>
+        <w:rPr>
+          <w:rFonts w:ascii="Calibri" w:hAnsi="Calibri" w:eastAsia="Microsoft YaHei UI"/>
+          <w:b w:val="0"/>
+          <w:sz w:val="22"/>
+        </w:rPr>
+        <w:t>写明本次判断使用的画面或测量证据并保存。</w:t>
+      </w:r>
+    </w:p>
+    <w:p>
+      <w:pPr>
+        <w:spacing w:before="0" w:after="80" w:line="300" w:lineRule="auto"/>
+        <w:numPr>
+          <w:ilvl w:val="0"/>
+          <w:numId w:val="17"/>
+        </w:numPr>
+      </w:pPr>
+      <w:r>
+        <w:rPr>
+          <w:rFonts w:ascii="Calibri" w:hAnsi="Calibri" w:eastAsia="Microsoft YaHei UI"/>
+          <w:b w:val="0"/>
+          <w:sz w:val="22"/>
+        </w:rPr>
         <w:t>每次复查都会追加历史记录，不覆盖上一版本。</w:t>
       </w:r>
     </w:p>
@@ -1324,7 +1426,7 @@
         <w:spacing w:before="0" w:after="80" w:line="300" w:lineRule="auto"/>
         <w:numPr>
           <w:ilvl w:val="0"/>
-          <w:numId w:val="17"/>
+          <w:numId w:val="18"/>
         </w:numPr>
       </w:pPr>
       <w:r>
@@ -1334,112 +1436,6 @@
           <w:sz w:val="22"/>
         </w:rPr>
         <w:t>打开“质量门禁”页，点击“新建质量门禁”。</w:t>
-      </w:r>
-    </w:p>
-    <w:p>
-      <w:pPr>
-        <w:spacing w:before="0" w:after="80" w:line="300" w:lineRule="auto"/>
-        <w:numPr>
-          <w:ilvl w:val="0"/>
-          <w:numId w:val="17"/>
-        </w:numPr>
-      </w:pPr>
-      <w:r>
-        <w:rPr>
-          <w:rFonts w:ascii="Calibri" w:hAnsi="Calibri" w:eastAsia="Microsoft YaHei UI"/>
-          <w:b w:val="0"/>
-          <w:sz w:val="22"/>
-        </w:rPr>
-        <w:t>填写门禁名称、维度、所属项目和明确的验收条件。</w:t>
-      </w:r>
-    </w:p>
-    <w:p>
-      <w:pPr>
-        <w:spacing w:before="0" w:after="80" w:line="300" w:lineRule="auto"/>
-        <w:numPr>
-          <w:ilvl w:val="0"/>
-          <w:numId w:val="17"/>
-        </w:numPr>
-      </w:pPr>
-      <w:r>
-        <w:rPr>
-          <w:rFonts w:ascii="Calibri" w:hAnsi="Calibri" w:eastAsia="Microsoft YaHei UI"/>
-          <w:b w:val="0"/>
-          <w:sz w:val="22"/>
-        </w:rPr>
-        <w:t>决定它是否为必需门禁并保存。</w:t>
-      </w:r>
-    </w:p>
-    <w:p>
-      <w:pPr>
-        <w:spacing w:before="0" w:after="80" w:line="300" w:lineRule="auto"/>
-        <w:numPr>
-          <w:ilvl w:val="0"/>
-          <w:numId w:val="17"/>
-        </w:numPr>
-      </w:pPr>
-      <w:r>
-        <w:rPr>
-          <w:rFonts w:ascii="Calibri" w:hAnsi="Calibri" w:eastAsia="Microsoft YaHei UI"/>
-          <w:b w:val="0"/>
-          <w:sz w:val="22"/>
-        </w:rPr>
-        <w:t>新版本完成后点击“评估当前版本”，记录通过、需复核、未通过或证据不足。</w:t>
-      </w:r>
-    </w:p>
-    <w:p>
-      <w:pPr>
-        <w:spacing w:before="0" w:after="80" w:line="300" w:lineRule="auto"/>
-        <w:numPr>
-          <w:ilvl w:val="0"/>
-          <w:numId w:val="17"/>
-        </w:numPr>
-      </w:pPr>
-      <w:r>
-        <w:rPr>
-          <w:rFonts w:ascii="Calibri" w:hAnsi="Calibri" w:eastAsia="Microsoft YaHei UI"/>
-          <w:b w:val="0"/>
-          <w:sz w:val="22"/>
-        </w:rPr>
-        <w:t>需要快速建立基线时，选择制作阶段和项目，点击“应用阶段门禁模板”。</w:t>
-      </w:r>
-    </w:p>
-    <w:p>
-      <w:r>
-        <w:rPr>
-          <w:rFonts w:ascii="Calibri" w:hAnsi="Calibri" w:eastAsia="Microsoft YaHei UI"/>
-          <w:b w:val="0"/>
-          <w:sz w:val="22"/>
-        </w:rPr>
-        <w:t>质量门禁由用户定义。GATalk 不用综合分数代替判断，也不会把 AI 结论自动标记 为人工验收通过。</w:t>
-      </w:r>
-    </w:p>
-    <w:p>
-      <w:pPr>
-        <w:pStyle w:val="Heading1"/>
-      </w:pPr>
-      <w:r>
-        <w:rPr>
-          <w:rFonts w:ascii="Calibri" w:hAnsi="Calibri" w:eastAsia="Microsoft YaHei UI"/>
-          <w:b/>
-          <w:color w:val="2E74B5"/>
-          <w:sz w:val="32"/>
-        </w:rPr>
-        <w:t>6. 作品研究</w:t>
-      </w:r>
-    </w:p>
-    <w:p>
-      <w:pPr>
-        <w:pStyle w:val="Heading2"/>
-      </w:pPr>
-      <w:r>
-        <w:rPr>
-          <w:rFonts w:ascii="Calibri" w:hAnsi="Calibri" w:eastAsia="Microsoft YaHei UI"/>
-          <w:b/>
-          <w:color w:val="2E74B5"/>
-          <w:sz w:val="26"/>
-        </w:rPr>
-        <w:t>最短流程</w:t>
       </w:r>
     </w:p>
     <w:p>
@@ -1456,7 +1452,7 @@
           <w:b w:val="0"/>
           <w:sz w:val="22"/>
         </w:rPr>
-        <w:t>在首页选择“作品研究”。</w:t>
+        <w:t>填写门禁名称、维度、所属项目和明确的验收条件。</w:t>
       </w:r>
     </w:p>
     <w:p>
@@ -1473,7 +1469,7 @@
           <w:b w:val="0"/>
           <w:sz w:val="22"/>
         </w:rPr>
-        <w:t>点击“新建作品研究”，选择目录并输入标题。</w:t>
+        <w:t>决定它是否为必需门禁并保存。</w:t>
       </w:r>
     </w:p>
     <w:p>
@@ -1490,7 +1486,7 @@
           <w:b w:val="0"/>
           <w:sz w:val="22"/>
         </w:rPr>
-        <w:t>导入一张图片。</w:t>
+        <w:t>新版本完成后点击“评估当前版本”，记录通过、需复核、未通过或证据不足。</w:t>
       </w:r>
     </w:p>
     <w:p>
@@ -1507,7 +1503,45 @@
           <w:b w:val="0"/>
           <w:sz w:val="22"/>
         </w:rPr>
-        <w:t>填写作品类型、本次想研究什么和已知背景。</w:t>
+        <w:t>需要快速建立基线时，选择制作阶段和项目，点击“应用阶段门禁模板”。</w:t>
+      </w:r>
+    </w:p>
+    <w:p>
+      <w:r>
+        <w:rPr>
+          <w:rFonts w:ascii="Calibri" w:hAnsi="Calibri" w:eastAsia="Microsoft YaHei UI"/>
+          <w:b w:val="0"/>
+          <w:sz w:val="22"/>
+        </w:rPr>
+        <w:t>质量门禁由用户定义。GATalk 不用综合分数代替判断，也不会把 AI 结论自动标记 为人工验收通过。</w:t>
+      </w:r>
+    </w:p>
+    <w:p>
+      <w:pPr>
+        <w:pStyle w:val="Heading1"/>
+      </w:pPr>
+      <w:r>
+        <w:rPr>
+          <w:rFonts w:ascii="Calibri" w:hAnsi="Calibri" w:eastAsia="Microsoft YaHei UI"/>
+          <w:b/>
+          <w:color w:val="2E74B5"/>
+          <w:sz w:val="32"/>
+        </w:rPr>
+        <w:t>6. 作品研究</w:t>
+      </w:r>
+    </w:p>
+    <w:p>
+      <w:pPr>
+        <w:pStyle w:val="Heading2"/>
+      </w:pPr>
+      <w:r>
+        <w:rPr>
+          <w:rFonts w:ascii="Calibri" w:hAnsi="Calibri" w:eastAsia="Microsoft YaHei UI"/>
+          <w:b/>
+          <w:color w:val="2E74B5"/>
+          <w:sz w:val="26"/>
+        </w:rPr>
+        <w:t>最短流程</w:t>
       </w:r>
     </w:p>
     <w:p>
@@ -1515,7 +1549,7 @@
         <w:spacing w:before="0" w:after="80" w:line="300" w:lineRule="auto"/>
         <w:numPr>
           <w:ilvl w:val="0"/>
-          <w:numId w:val="18"/>
+          <w:numId w:val="19"/>
         </w:numPr>
       </w:pPr>
       <w:r>
@@ -1524,7 +1558,7 @@
           <w:b w:val="0"/>
           <w:sz w:val="22"/>
         </w:rPr>
-        <w:t>在“本地证据”查看明度、色板、空间网格和注意力代理。</w:t>
+        <w:t>在首页选择“作品研究”。</w:t>
       </w:r>
     </w:p>
     <w:p>
@@ -1532,7 +1566,7 @@
         <w:spacing w:before="0" w:after="80" w:line="300" w:lineRule="auto"/>
         <w:numPr>
           <w:ilvl w:val="0"/>
-          <w:numId w:val="18"/>
+          <w:numId w:val="19"/>
         </w:numPr>
       </w:pPr>
       <w:r>
@@ -1541,7 +1575,7 @@
           <w:b w:val="0"/>
           <w:sz w:val="22"/>
         </w:rPr>
-        <w:t>在“专家拆解”选择视觉 AI，查看发送清单后主动确认。</w:t>
+        <w:t>点击“新建作品研究”，选择目录并输入标题。</w:t>
       </w:r>
     </w:p>
     <w:p>
@@ -1549,7 +1583,7 @@
         <w:spacing w:before="0" w:after="80" w:line="300" w:lineRule="auto"/>
         <w:numPr>
           <w:ilvl w:val="0"/>
-          <w:numId w:val="18"/>
+          <w:numId w:val="19"/>
         </w:numPr>
       </w:pPr>
       <w:r>
@@ -1558,7 +1592,7 @@
           <w:b w:val="0"/>
           <w:sz w:val="22"/>
         </w:rPr>
-        <w:t>阅读十二维拆解和跨维度因果链。</w:t>
+        <w:t>导入一张图片。</w:t>
       </w:r>
     </w:p>
     <w:p>
@@ -1566,7 +1600,7 @@
         <w:spacing w:before="0" w:after="80" w:line="300" w:lineRule="auto"/>
         <w:numPr>
           <w:ilvl w:val="0"/>
-          <w:numId w:val="18"/>
+          <w:numId w:val="19"/>
         </w:numPr>
       </w:pPr>
       <w:r>
@@ -1575,7 +1609,7 @@
           <w:b w:val="0"/>
           <w:sz w:val="22"/>
         </w:rPr>
-        <w:t>在“学习笔记”写下自己的判断，保存。</w:t>
+        <w:t>填写作品类型、本次想研究什么和已知背景。</w:t>
       </w:r>
     </w:p>
     <w:p>
@@ -1583,7 +1617,75 @@
         <w:spacing w:before="0" w:after="80" w:line="300" w:lineRule="auto"/>
         <w:numPr>
           <w:ilvl w:val="0"/>
-          <w:numId w:val="18"/>
+          <w:numId w:val="19"/>
+        </w:numPr>
+      </w:pPr>
+      <w:r>
+        <w:rPr>
+          <w:rFonts w:ascii="Calibri" w:hAnsi="Calibri" w:eastAsia="Microsoft YaHei UI"/>
+          <w:b w:val="0"/>
+          <w:sz w:val="22"/>
+        </w:rPr>
+        <w:t>在“本地证据”查看明度、色板、空间网格和注意力代理。</w:t>
+      </w:r>
+    </w:p>
+    <w:p>
+      <w:pPr>
+        <w:spacing w:before="0" w:after="80" w:line="300" w:lineRule="auto"/>
+        <w:numPr>
+          <w:ilvl w:val="0"/>
+          <w:numId w:val="19"/>
+        </w:numPr>
+      </w:pPr>
+      <w:r>
+        <w:rPr>
+          <w:rFonts w:ascii="Calibri" w:hAnsi="Calibri" w:eastAsia="Microsoft YaHei UI"/>
+          <w:b w:val="0"/>
+          <w:sz w:val="22"/>
+        </w:rPr>
+        <w:t>在“专家拆解”选择视觉 AI，查看发送清单后主动确认。</w:t>
+      </w:r>
+    </w:p>
+    <w:p>
+      <w:pPr>
+        <w:spacing w:before="0" w:after="80" w:line="300" w:lineRule="auto"/>
+        <w:numPr>
+          <w:ilvl w:val="0"/>
+          <w:numId w:val="19"/>
+        </w:numPr>
+      </w:pPr>
+      <w:r>
+        <w:rPr>
+          <w:rFonts w:ascii="Calibri" w:hAnsi="Calibri" w:eastAsia="Microsoft YaHei UI"/>
+          <w:b w:val="0"/>
+          <w:sz w:val="22"/>
+        </w:rPr>
+        <w:t>阅读十二维拆解和跨维度因果链。</w:t>
+      </w:r>
+    </w:p>
+    <w:p>
+      <w:pPr>
+        <w:spacing w:before="0" w:after="80" w:line="300" w:lineRule="auto"/>
+        <w:numPr>
+          <w:ilvl w:val="0"/>
+          <w:numId w:val="19"/>
+        </w:numPr>
+      </w:pPr>
+      <w:r>
+        <w:rPr>
+          <w:rFonts w:ascii="Calibri" w:hAnsi="Calibri" w:eastAsia="Microsoft YaHei UI"/>
+          <w:b w:val="0"/>
+          <w:sz w:val="22"/>
+        </w:rPr>
+        <w:t>在“学习笔记”写下自己的判断，保存。</w:t>
+      </w:r>
+    </w:p>
+    <w:p>
+      <w:pPr>
+        <w:spacing w:before="0" w:after="80" w:line="300" w:lineRule="auto"/>
+        <w:numPr>
+          <w:ilvl w:val="0"/>
+          <w:numId w:val="19"/>
         </w:numPr>
       </w:pPr>
       <w:r>
@@ -2027,7 +2129,7 @@
         <w:spacing w:before="0" w:after="80" w:line="300" w:lineRule="auto"/>
         <w:numPr>
           <w:ilvl w:val="0"/>
-          <w:numId w:val="19"/>
+          <w:numId w:val="20"/>
         </w:numPr>
       </w:pPr>
       <w:r>
@@ -2037,132 +2139,6 @@
           <w:sz w:val="22"/>
         </w:rPr>
         <w:t>导入主原画后，打开“清单与校正 → 拆分依据”。</w:t>
-      </w:r>
-    </w:p>
-    <w:p>
-      <w:pPr>
-        <w:spacing w:before="0" w:after="80" w:line="300" w:lineRule="auto"/>
-        <w:numPr>
-          <w:ilvl w:val="0"/>
-          <w:numId w:val="19"/>
-        </w:numPr>
-      </w:pPr>
-      <w:r>
-        <w:rPr>
-          <w:rFonts w:ascii="Calibri" w:hAnsi="Calibri" w:eastAsia="Microsoft YaHei UI"/>
-          <w:b w:val="0"/>
-          <w:sz w:val="22"/>
-        </w:rPr>
-        <w:t>可先选择“检查发送内容并分析场景结构”，也可直接从预设新建。</w:t>
-      </w:r>
-    </w:p>
-    <w:p>
-      <w:pPr>
-        <w:spacing w:before="0" w:after="80" w:line="300" w:lineRule="auto"/>
-        <w:numPr>
-          <w:ilvl w:val="0"/>
-          <w:numId w:val="19"/>
-        </w:numPr>
-      </w:pPr>
-      <w:r>
-        <w:rPr>
-          <w:rFonts w:ascii="Calibri" w:hAnsi="Calibri" w:eastAsia="Microsoft YaHei UI"/>
-          <w:b w:val="0"/>
-          <w:sz w:val="22"/>
-        </w:rPr>
-        <w:t>检查场景原型、空间结构、生产系统、资产族和不确定性。</w:t>
-      </w:r>
-    </w:p>
-    <w:p>
-      <w:pPr>
-        <w:spacing w:before="0" w:after="80" w:line="300" w:lineRule="auto"/>
-        <w:numPr>
-          <w:ilvl w:val="0"/>
-          <w:numId w:val="19"/>
-        </w:numPr>
-      </w:pPr>
-      <w:r>
-        <w:rPr>
-          <w:rFonts w:ascii="Calibri" w:hAnsi="Calibri" w:eastAsia="Microsoft YaHei UI"/>
-          <w:b w:val="0"/>
-          <w:sz w:val="22"/>
-        </w:rPr>
-        <w:t>选择“关卡空间与整体”“完整建筑与装配体”“可复用生产套件”“细节组件” 或“自定义混合层级”。</w:t>
-      </w:r>
-    </w:p>
-    <w:p>
-      <w:pPr>
-        <w:spacing w:before="0" w:after="80" w:line="300" w:lineRule="auto"/>
-        <w:numPr>
-          <w:ilvl w:val="0"/>
-          <w:numId w:val="19"/>
-        </w:numPr>
-      </w:pPr>
-      <w:r>
-        <w:rPr>
-          <w:rFonts w:ascii="Calibri" w:hAnsi="Calibri" w:eastAsia="Microsoft YaHei UI"/>
-          <w:b w:val="0"/>
-          <w:sz w:val="22"/>
-        </w:rPr>
-        <w:t>分别调整建筑、道具、植被、地形、材质等类别的 0–4 级深度。</w:t>
-      </w:r>
-    </w:p>
-    <w:p>
-      <w:pPr>
-        <w:spacing w:before="0" w:after="80" w:line="300" w:lineRule="auto"/>
-        <w:numPr>
-          <w:ilvl w:val="0"/>
-          <w:numId w:val="19"/>
-        </w:numPr>
-      </w:pPr>
-      <w:r>
-        <w:rPr>
-          <w:rFonts w:ascii="Calibri" w:hAnsi="Calibri" w:eastAsia="Microsoft YaHei UI"/>
-          <w:b w:val="0"/>
-          <w:sz w:val="22"/>
-        </w:rPr>
-        <w:t>填写人工约束，点击“保存方案”。</w:t>
-      </w:r>
-    </w:p>
-    <w:p>
-      <w:pPr>
-        <w:spacing w:before="0" w:after="80" w:line="300" w:lineRule="auto"/>
-        <w:numPr>
-          <w:ilvl w:val="0"/>
-          <w:numId w:val="19"/>
-        </w:numPr>
-      </w:pPr>
-      <w:r>
-        <w:rPr>
-          <w:rFonts w:ascii="Calibri" w:hAnsi="Calibri" w:eastAsia="Microsoft YaHei UI"/>
-          <w:b w:val="0"/>
-          <w:sz w:val="22"/>
-        </w:rPr>
-        <w:t>进入“资产清单”，按当前方案生成清单。</w:t>
-      </w:r>
-    </w:p>
-    <w:p>
-      <w:r>
-        <w:rPr>
-          <w:rFonts w:ascii="Calibri" w:hAnsi="Calibri" w:eastAsia="Microsoft YaHei UI"/>
-          <w:b w:val="0"/>
-          <w:sz w:val="22"/>
-        </w:rPr>
-        <w:t>深度 1 只保留场景区域或完整对象；2 拆到完整建筑、桥梁、岩组或群落；3 拆到 可复用生产套件；4 才继续拆门窗、框架、檐口、栏杆、装饰和控制变体。不同方案 的资产互不覆盖，可在同一项目中切换。自然环境会按地形、岩组、物种、变体、 群落和地被理解，不照搬建筑拆法。</w:t>
-      </w:r>
-    </w:p>
-    <w:p>
-      <w:pPr>
-        <w:pStyle w:val="Heading2"/>
-      </w:pPr>
-      <w:r>
-        <w:rPr>
-          <w:rFonts w:ascii="Calibri" w:hAnsi="Calibri" w:eastAsia="Microsoft YaHei UI"/>
-          <w:b/>
-          <w:color w:val="2E74B5"/>
-          <w:sz w:val="26"/>
-        </w:rPr>
-        <w:t>资产拆分提示语</w:t>
       </w:r>
     </w:p>
     <w:p>
@@ -2179,7 +2155,7 @@
           <w:b w:val="0"/>
           <w:sz w:val="22"/>
         </w:rPr>
-        <w:t>导入主原画，可选补充参考，打开“生成提示语”。</w:t>
+        <w:t>可先选择“检查发送内容并分析场景结构”，也可直接从预设新建。</w:t>
       </w:r>
     </w:p>
     <w:p>
@@ -2196,7 +2172,7 @@
           <w:b w:val="0"/>
           <w:sz w:val="22"/>
         </w:rPr>
-        <w:t>在“1 生成设置”选择供应商、模型和目标外部生图工具。</w:t>
+        <w:t>检查场景原型、空间结构、生产系统、资产族和不确定性。</w:t>
       </w:r>
     </w:p>
     <w:p>
@@ -2213,7 +2189,7 @@
           <w:b w:val="0"/>
           <w:sz w:val="22"/>
         </w:rPr>
-        <w:t>点击“检查发送内容并生成初稿”，核对后确认。</w:t>
+        <w:t>选择“关卡空间与整体”“完整建筑与装配体”“可复用生产套件”“细节组件” 或“自定义混合层级”。</w:t>
       </w:r>
     </w:p>
     <w:p>
@@ -2230,7 +2206,7 @@
           <w:b w:val="0"/>
           <w:sz w:val="22"/>
         </w:rPr>
-        <w:t>向下滚动到“2 当前提示语”，检查中文、英文、负面提示和硬约束。</w:t>
+        <w:t>分别调整建筑、道具、植被、地形、材质等类别的 0–4 级深度。</w:t>
       </w:r>
     </w:p>
     <w:p>
@@ -2247,7 +2223,7 @@
           <w:b w:val="0"/>
           <w:sz w:val="22"/>
         </w:rPr>
-        <w:t>在“3 继续修订”填写要求；默认只发送文字。</w:t>
+        <w:t>填写人工约束，点击“保存方案”。</w:t>
       </w:r>
     </w:p>
     <w:p>
@@ -2264,51 +2240,17 @@
           <w:b w:val="0"/>
           <w:sz w:val="22"/>
         </w:rPr>
-        <w:t>需要 AI 重新观察原画时，勾选“本次迭代重新附带原画”。</w:t>
-      </w:r>
-    </w:p>
-    <w:p>
-      <w:pPr>
-        <w:spacing w:before="0" w:after="80" w:line="300" w:lineRule="auto"/>
-        <w:numPr>
-          <w:ilvl w:val="0"/>
-          <w:numId w:val="20"/>
-        </w:numPr>
-      </w:pPr>
+        <w:t>进入“资产清单”，按当前方案生成清单。</w:t>
+      </w:r>
+    </w:p>
+    <w:p>
       <w:r>
         <w:rPr>
           <w:rFonts w:ascii="Calibri" w:hAnsi="Calibri" w:eastAsia="Microsoft YaHei UI"/>
           <w:b w:val="0"/>
           <w:sz w:val="22"/>
         </w:rPr>
-        <w:t>可直接改文字并点击“保存手动修改”；每次保存都会新增历史版本。</w:t>
-      </w:r>
-    </w:p>
-    <w:p>
-      <w:pPr>
-        <w:spacing w:before="0" w:after="80" w:line="300" w:lineRule="auto"/>
-        <w:numPr>
-          <w:ilvl w:val="0"/>
-          <w:numId w:val="20"/>
-        </w:numPr>
-      </w:pPr>
-      <w:r>
-        <w:rPr>
-          <w:rFonts w:ascii="Calibri" w:hAnsi="Calibri" w:eastAsia="Microsoft YaHei UI"/>
-          <w:b w:val="0"/>
-          <w:sz w:val="22"/>
-        </w:rPr>
-        <w:t>点击“复制中文”“复制英文”或“复制完整提示语”，粘贴到外部生图工具。</w:t>
-      </w:r>
-    </w:p>
-    <w:p>
-      <w:r>
-        <w:rPr>
-          <w:rFonts w:ascii="Calibri" w:hAnsi="Calibri" w:eastAsia="Microsoft YaHei UI"/>
-          <w:b w:val="0"/>
-          <w:sz w:val="22"/>
-        </w:rPr>
-        <w:t>初稿和每次协商各消耗一次所选视觉模型调用；复制、手动编辑和保存不调用 API。 “离线 Mock”只验证流程，不会理解原画。项目重开后会恢复会话和所有版本。</w:t>
+        <w:t>深度 1 只保留场景区域或完整对象；2 拆到完整建筑、桥梁、岩组或群落；3 拆到 可复用生产套件；4 才继续拆门窗、框架、檐口、栏杆、装饰和控制变体。不同方案 的资产互不覆盖，可在同一项目中切换。自然环境会按地形、岩组、物种、变体、 群落和地被理解，不照搬建筑拆法。</w:t>
       </w:r>
     </w:p>
     <w:p>
@@ -2322,7 +2264,7 @@
           <w:color w:val="2E74B5"/>
           <w:sz w:val="26"/>
         </w:rPr>
-        <w:t>资产生产规格与交接</w:t>
+        <w:t>资产拆分提示语</w:t>
       </w:r>
     </w:p>
     <w:p>
@@ -2339,7 +2281,7 @@
           <w:b w:val="0"/>
           <w:sz w:val="22"/>
         </w:rPr>
-        <w:t>完成一套资产清单后打开“生产交接”页。</w:t>
+        <w:t>导入主原画，可选补充参考，打开“生成提示语”。</w:t>
       </w:r>
     </w:p>
     <w:p>
@@ -2356,7 +2298,7 @@
           <w:b w:val="0"/>
           <w:sz w:val="22"/>
         </w:rPr>
-        <w:t>点击“同步生产规格”，为当前方案建立规格记录。</w:t>
+        <w:t>在“1 生成设置”选择供应商、模型和目标外部生图工具。</w:t>
       </w:r>
     </w:p>
     <w:p>
@@ -2373,7 +2315,7 @@
           <w:b w:val="0"/>
           <w:sz w:val="22"/>
         </w:rPr>
-        <w:t>逐项核对资产编码、目标尺寸说明、枢轴、几何策略、材质槽、贴图组、LOD、 碰撞、Nanite、UE 目录、依赖和交付物。</w:t>
+        <w:t>点击“检查发送内容并生成初稿”，核对后确认。</w:t>
       </w:r>
     </w:p>
     <w:p>
@@ -2390,7 +2332,7 @@
           <w:b w:val="0"/>
           <w:sz w:val="22"/>
         </w:rPr>
-        <w:t>保存修改。重复编码、缺失依赖或循环依赖必须先修正。</w:t>
+        <w:t>向下滚动到“2 当前提示语”，检查中文、英文、负面提示和硬约束。</w:t>
       </w:r>
     </w:p>
     <w:p>
@@ -2407,6 +2349,166 @@
           <w:b w:val="0"/>
           <w:sz w:val="22"/>
         </w:rPr>
+        <w:t>在“3 继续修订”填写要求；默认只发送文字。</w:t>
+      </w:r>
+    </w:p>
+    <w:p>
+      <w:pPr>
+        <w:spacing w:before="0" w:after="80" w:line="300" w:lineRule="auto"/>
+        <w:numPr>
+          <w:ilvl w:val="0"/>
+          <w:numId w:val="21"/>
+        </w:numPr>
+      </w:pPr>
+      <w:r>
+        <w:rPr>
+          <w:rFonts w:ascii="Calibri" w:hAnsi="Calibri" w:eastAsia="Microsoft YaHei UI"/>
+          <w:b w:val="0"/>
+          <w:sz w:val="22"/>
+        </w:rPr>
+        <w:t>需要 AI 重新观察原画时，勾选“本次迭代重新附带原画”。</w:t>
+      </w:r>
+    </w:p>
+    <w:p>
+      <w:pPr>
+        <w:spacing w:before="0" w:after="80" w:line="300" w:lineRule="auto"/>
+        <w:numPr>
+          <w:ilvl w:val="0"/>
+          <w:numId w:val="21"/>
+        </w:numPr>
+      </w:pPr>
+      <w:r>
+        <w:rPr>
+          <w:rFonts w:ascii="Calibri" w:hAnsi="Calibri" w:eastAsia="Microsoft YaHei UI"/>
+          <w:b w:val="0"/>
+          <w:sz w:val="22"/>
+        </w:rPr>
+        <w:t>可直接改文字并点击“保存手动修改”；每次保存都会新增历史版本。</w:t>
+      </w:r>
+    </w:p>
+    <w:p>
+      <w:pPr>
+        <w:spacing w:before="0" w:after="80" w:line="300" w:lineRule="auto"/>
+        <w:numPr>
+          <w:ilvl w:val="0"/>
+          <w:numId w:val="21"/>
+        </w:numPr>
+      </w:pPr>
+      <w:r>
+        <w:rPr>
+          <w:rFonts w:ascii="Calibri" w:hAnsi="Calibri" w:eastAsia="Microsoft YaHei UI"/>
+          <w:b w:val="0"/>
+          <w:sz w:val="22"/>
+        </w:rPr>
+        <w:t>点击“复制中文”“复制英文”或“复制完整提示语”，粘贴到外部生图工具。</w:t>
+      </w:r>
+    </w:p>
+    <w:p>
+      <w:r>
+        <w:rPr>
+          <w:rFonts w:ascii="Calibri" w:hAnsi="Calibri" w:eastAsia="Microsoft YaHei UI"/>
+          <w:b w:val="0"/>
+          <w:sz w:val="22"/>
+        </w:rPr>
+        <w:t>初稿和每次协商各消耗一次所选视觉模型调用；复制、手动编辑和保存不调用 API。 “离线 Mock”只验证流程，不会理解原画。项目重开后会恢复会话和所有版本。</w:t>
+      </w:r>
+    </w:p>
+    <w:p>
+      <w:pPr>
+        <w:pStyle w:val="Heading2"/>
+      </w:pPr>
+      <w:r>
+        <w:rPr>
+          <w:rFonts w:ascii="Calibri" w:hAnsi="Calibri" w:eastAsia="Microsoft YaHei UI"/>
+          <w:b/>
+          <w:color w:val="2E74B5"/>
+          <w:sz w:val="26"/>
+        </w:rPr>
+        <w:t>资产生产规格与交接</w:t>
+      </w:r>
+    </w:p>
+    <w:p>
+      <w:pPr>
+        <w:spacing w:before="0" w:after="80" w:line="300" w:lineRule="auto"/>
+        <w:numPr>
+          <w:ilvl w:val="0"/>
+          <w:numId w:val="22"/>
+        </w:numPr>
+      </w:pPr>
+      <w:r>
+        <w:rPr>
+          <w:rFonts w:ascii="Calibri" w:hAnsi="Calibri" w:eastAsia="Microsoft YaHei UI"/>
+          <w:b w:val="0"/>
+          <w:sz w:val="22"/>
+        </w:rPr>
+        <w:t>完成一套资产清单后打开“生产交接”页。</w:t>
+      </w:r>
+    </w:p>
+    <w:p>
+      <w:pPr>
+        <w:spacing w:before="0" w:after="80" w:line="300" w:lineRule="auto"/>
+        <w:numPr>
+          <w:ilvl w:val="0"/>
+          <w:numId w:val="22"/>
+        </w:numPr>
+      </w:pPr>
+      <w:r>
+        <w:rPr>
+          <w:rFonts w:ascii="Calibri" w:hAnsi="Calibri" w:eastAsia="Microsoft YaHei UI"/>
+          <w:b w:val="0"/>
+          <w:sz w:val="22"/>
+        </w:rPr>
+        <w:t>点击“同步生产规格”，为当前方案建立规格记录。</w:t>
+      </w:r>
+    </w:p>
+    <w:p>
+      <w:pPr>
+        <w:spacing w:before="0" w:after="80" w:line="300" w:lineRule="auto"/>
+        <w:numPr>
+          <w:ilvl w:val="0"/>
+          <w:numId w:val="22"/>
+        </w:numPr>
+      </w:pPr>
+      <w:r>
+        <w:rPr>
+          <w:rFonts w:ascii="Calibri" w:hAnsi="Calibri" w:eastAsia="Microsoft YaHei UI"/>
+          <w:b w:val="0"/>
+          <w:sz w:val="22"/>
+        </w:rPr>
+        <w:t>逐项核对资产编码、目标尺寸说明、枢轴、几何策略、材质槽、贴图组、LOD、 碰撞、Nanite、UE 目录、依赖和交付物。</w:t>
+      </w:r>
+    </w:p>
+    <w:p>
+      <w:pPr>
+        <w:spacing w:before="0" w:after="80" w:line="300" w:lineRule="auto"/>
+        <w:numPr>
+          <w:ilvl w:val="0"/>
+          <w:numId w:val="22"/>
+        </w:numPr>
+      </w:pPr>
+      <w:r>
+        <w:rPr>
+          <w:rFonts w:ascii="Calibri" w:hAnsi="Calibri" w:eastAsia="Microsoft YaHei UI"/>
+          <w:b w:val="0"/>
+          <w:sz w:val="22"/>
+        </w:rPr>
+        <w:t>保存修改。重复编码、缺失依赖或循环依赖必须先修正。</w:t>
+      </w:r>
+    </w:p>
+    <w:p>
+      <w:pPr>
+        <w:spacing w:before="0" w:after="80" w:line="300" w:lineRule="auto"/>
+        <w:numPr>
+          <w:ilvl w:val="0"/>
+          <w:numId w:val="22"/>
+        </w:numPr>
+      </w:pPr>
+      <w:r>
+        <w:rPr>
+          <w:rFonts w:ascii="Calibri" w:hAnsi="Calibri" w:eastAsia="Microsoft YaHei UI"/>
+          <w:b w:val="0"/>
+          <w:sz w:val="22"/>
+        </w:rPr>
         <w:t>导出 JSON 或 CSV，交给建模、材质或项目管理流程。</w:t>
       </w:r>
     </w:p>
@@ -2521,7 +2623,7 @@
         <w:spacing w:before="0" w:after="80" w:line="300" w:lineRule="auto"/>
         <w:numPr>
           <w:ilvl w:val="0"/>
-          <w:numId w:val="22"/>
+          <w:numId w:val="23"/>
         </w:numPr>
       </w:pPr>
       <w:r>
@@ -2538,7 +2640,7 @@
         <w:spacing w:before="0" w:after="80" w:line="300" w:lineRule="auto"/>
         <w:numPr>
           <w:ilvl w:val="0"/>
-          <w:numId w:val="22"/>
+          <w:numId w:val="23"/>
         </w:numPr>
       </w:pPr>
       <w:r>
@@ -2555,7 +2657,7 @@
         <w:spacing w:before="0" w:after="80" w:line="300" w:lineRule="auto"/>
         <w:numPr>
           <w:ilvl w:val="0"/>
-          <w:numId w:val="22"/>
+          <w:numId w:val="23"/>
         </w:numPr>
       </w:pPr>
       <w:r>
@@ -2572,7 +2674,7 @@
         <w:spacing w:before="0" w:after="80" w:line="300" w:lineRule="auto"/>
         <w:numPr>
           <w:ilvl w:val="0"/>
-          <w:numId w:val="22"/>
+          <w:numId w:val="23"/>
         </w:numPr>
       </w:pPr>
       <w:r>
@@ -2589,7 +2691,7 @@
         <w:spacing w:before="0" w:after="80" w:line="300" w:lineRule="auto"/>
         <w:numPr>
           <w:ilvl w:val="0"/>
-          <w:numId w:val="22"/>
+          <w:numId w:val="23"/>
         </w:numPr>
       </w:pPr>
       <w:r>
@@ -2606,7 +2708,7 @@
         <w:spacing w:before="0" w:after="80" w:line="300" w:lineRule="auto"/>
         <w:numPr>
           <w:ilvl w:val="0"/>
-          <w:numId w:val="22"/>
+          <w:numId w:val="23"/>
         </w:numPr>
       </w:pPr>
       <w:r>
@@ -2828,7 +2930,7 @@
         <w:spacing w:before="0" w:after="80" w:line="300" w:lineRule="auto"/>
         <w:numPr>
           <w:ilvl w:val="0"/>
-          <w:numId w:val="23"/>
+          <w:numId w:val="24"/>
         </w:numPr>
       </w:pPr>
       <w:r>
@@ -2845,7 +2947,7 @@
         <w:spacing w:before="0" w:after="80" w:line="300" w:lineRule="auto"/>
         <w:numPr>
           <w:ilvl w:val="0"/>
-          <w:numId w:val="23"/>
+          <w:numId w:val="24"/>
         </w:numPr>
       </w:pPr>
       <w:r>
@@ -2862,7 +2964,7 @@
         <w:spacing w:before="0" w:after="80" w:line="300" w:lineRule="auto"/>
         <w:numPr>
           <w:ilvl w:val="0"/>
-          <w:numId w:val="23"/>
+          <w:numId w:val="24"/>
         </w:numPr>
       </w:pPr>
       <w:r>
@@ -2879,7 +2981,7 @@
         <w:spacing w:before="0" w:after="80" w:line="300" w:lineRule="auto"/>
         <w:numPr>
           <w:ilvl w:val="0"/>
-          <w:numId w:val="23"/>
+          <w:numId w:val="24"/>
         </w:numPr>
       </w:pPr>
       <w:r>
@@ -2896,7 +2998,7 @@
         <w:spacing w:before="0" w:after="80" w:line="300" w:lineRule="auto"/>
         <w:numPr>
           <w:ilvl w:val="0"/>
-          <w:numId w:val="23"/>
+          <w:numId w:val="24"/>
         </w:numPr>
       </w:pPr>
       <w:r>
@@ -2913,7 +3015,7 @@
         <w:spacing w:before="0" w:after="80" w:line="300" w:lineRule="auto"/>
         <w:numPr>
           <w:ilvl w:val="0"/>
-          <w:numId w:val="23"/>
+          <w:numId w:val="24"/>
         </w:numPr>
       </w:pPr>
       <w:r>
@@ -2930,7 +3032,7 @@
         <w:spacing w:before="0" w:after="80" w:line="300" w:lineRule="auto"/>
         <w:numPr>
           <w:ilvl w:val="0"/>
-          <w:numId w:val="23"/>
+          <w:numId w:val="24"/>
         </w:numPr>
       </w:pPr>
       <w:r>
@@ -2947,7 +3049,7 @@
         <w:spacing w:before="0" w:after="80" w:line="300" w:lineRule="auto"/>
         <w:numPr>
           <w:ilvl w:val="0"/>
-          <w:numId w:val="23"/>
+          <w:numId w:val="24"/>
         </w:numPr>
       </w:pPr>
       <w:r>
@@ -2964,7 +3066,7 @@
         <w:spacing w:before="0" w:after="80" w:line="300" w:lineRule="auto"/>
         <w:numPr>
           <w:ilvl w:val="0"/>
-          <w:numId w:val="23"/>
+          <w:numId w:val="24"/>
         </w:numPr>
       </w:pPr>
       <w:r>
@@ -2981,7 +3083,7 @@
         <w:spacing w:before="0" w:after="80" w:line="300" w:lineRule="auto"/>
         <w:numPr>
           <w:ilvl w:val="0"/>
-          <w:numId w:val="23"/>
+          <w:numId w:val="24"/>
         </w:numPr>
       </w:pPr>
       <w:r>
@@ -3340,7 +3442,7 @@
         <w:spacing w:before="0" w:after="80" w:line="300" w:lineRule="auto"/>
         <w:numPr>
           <w:ilvl w:val="0"/>
-          <w:numId w:val="24"/>
+          <w:numId w:val="25"/>
         </w:numPr>
       </w:pPr>
       <w:r>
@@ -3357,7 +3459,7 @@
         <w:spacing w:before="0" w:after="80" w:line="300" w:lineRule="auto"/>
         <w:numPr>
           <w:ilvl w:val="0"/>
-          <w:numId w:val="24"/>
+          <w:numId w:val="25"/>
         </w:numPr>
       </w:pPr>
       <w:r>
@@ -3374,7 +3476,7 @@
         <w:spacing w:before="0" w:after="80" w:line="300" w:lineRule="auto"/>
         <w:numPr>
           <w:ilvl w:val="0"/>
-          <w:numId w:val="24"/>
+          <w:numId w:val="25"/>
         </w:numPr>
       </w:pPr>
       <w:r>
@@ -3391,7 +3493,7 @@
         <w:spacing w:before="0" w:after="80" w:line="300" w:lineRule="auto"/>
         <w:numPr>
           <w:ilvl w:val="0"/>
-          <w:numId w:val="24"/>
+          <w:numId w:val="25"/>
         </w:numPr>
       </w:pPr>
       <w:r>
@@ -3408,7 +3510,7 @@
         <w:spacing w:before="0" w:after="80" w:line="300" w:lineRule="auto"/>
         <w:numPr>
           <w:ilvl w:val="0"/>
-          <w:numId w:val="24"/>
+          <w:numId w:val="25"/>
         </w:numPr>
       </w:pPr>
       <w:r>
@@ -3425,7 +3527,7 @@
         <w:spacing w:before="0" w:after="80" w:line="300" w:lineRule="auto"/>
         <w:numPr>
           <w:ilvl w:val="0"/>
-          <w:numId w:val="24"/>
+          <w:numId w:val="25"/>
         </w:numPr>
       </w:pPr>
       <w:r>
@@ -3442,7 +3544,7 @@
         <w:spacing w:before="0" w:after="80" w:line="300" w:lineRule="auto"/>
         <w:numPr>
           <w:ilvl w:val="0"/>
-          <w:numId w:val="24"/>
+          <w:numId w:val="25"/>
         </w:numPr>
       </w:pPr>
       <w:r>
@@ -3459,7 +3561,7 @@
         <w:spacing w:before="0" w:after="80" w:line="300" w:lineRule="auto"/>
         <w:numPr>
           <w:ilvl w:val="0"/>
-          <w:numId w:val="24"/>
+          <w:numId w:val="25"/>
         </w:numPr>
       </w:pPr>
       <w:r>
@@ -3800,7 +3902,7 @@
         <w:spacing w:before="0" w:after="80" w:line="300" w:lineRule="auto"/>
         <w:numPr>
           <w:ilvl w:val="0"/>
-          <w:numId w:val="25"/>
+          <w:numId w:val="26"/>
         </w:numPr>
       </w:pPr>
       <w:r>
@@ -3817,7 +3919,7 @@
         <w:spacing w:before="0" w:after="80" w:line="300" w:lineRule="auto"/>
         <w:numPr>
           <w:ilvl w:val="0"/>
-          <w:numId w:val="25"/>
+          <w:numId w:val="26"/>
         </w:numPr>
       </w:pPr>
       <w:r>
@@ -3834,7 +3936,7 @@
         <w:spacing w:before="0" w:after="80" w:line="300" w:lineRule="auto"/>
         <w:numPr>
           <w:ilvl w:val="0"/>
-          <w:numId w:val="25"/>
+          <w:numId w:val="26"/>
         </w:numPr>
       </w:pPr>
       <w:r>
@@ -3851,7 +3953,7 @@
         <w:spacing w:before="0" w:after="80" w:line="300" w:lineRule="auto"/>
         <w:numPr>
           <w:ilvl w:val="0"/>
-          <w:numId w:val="25"/>
+          <w:numId w:val="26"/>
         </w:numPr>
       </w:pPr>
       <w:r>
@@ -3957,7 +4059,7 @@
         <w:spacing w:before="0" w:after="80" w:line="300" w:lineRule="auto"/>
         <w:numPr>
           <w:ilvl w:val="0"/>
-          <w:numId w:val="26"/>
+          <w:numId w:val="27"/>
         </w:numPr>
       </w:pPr>
       <w:r>
@@ -3974,7 +4076,7 @@
         <w:spacing w:before="0" w:after="80" w:line="300" w:lineRule="auto"/>
         <w:numPr>
           <w:ilvl w:val="0"/>
-          <w:numId w:val="26"/>
+          <w:numId w:val="27"/>
         </w:numPr>
       </w:pPr>
       <w:r>
@@ -3991,7 +4093,7 @@
         <w:spacing w:before="0" w:after="80" w:line="300" w:lineRule="auto"/>
         <w:numPr>
           <w:ilvl w:val="0"/>
-          <w:numId w:val="26"/>
+          <w:numId w:val="27"/>
         </w:numPr>
       </w:pPr>
       <w:r>
@@ -4008,7 +4110,7 @@
         <w:spacing w:before="0" w:after="80" w:line="300" w:lineRule="auto"/>
         <w:numPr>
           <w:ilvl w:val="0"/>
-          <w:numId w:val="26"/>
+          <w:numId w:val="27"/>
         </w:numPr>
       </w:pPr>
       <w:r>
@@ -4131,7 +4233,7 @@
         <w:spacing w:before="0" w:after="80" w:line="300" w:lineRule="auto"/>
         <w:numPr>
           <w:ilvl w:val="0"/>
-          <w:numId w:val="27"/>
+          <w:numId w:val="28"/>
         </w:numPr>
       </w:pPr>
       <w:r>
@@ -4148,7 +4250,7 @@
         <w:spacing w:before="0" w:after="80" w:line="300" w:lineRule="auto"/>
         <w:numPr>
           <w:ilvl w:val="0"/>
-          <w:numId w:val="27"/>
+          <w:numId w:val="28"/>
         </w:numPr>
       </w:pPr>
       <w:r>
@@ -4165,7 +4267,7 @@
         <w:spacing w:before="0" w:after="80" w:line="300" w:lineRule="auto"/>
         <w:numPr>
           <w:ilvl w:val="0"/>
-          <w:numId w:val="27"/>
+          <w:numId w:val="28"/>
         </w:numPr>
       </w:pPr>
       <w:r>
@@ -4182,7 +4284,7 @@
         <w:spacing w:before="0" w:after="80" w:line="300" w:lineRule="auto"/>
         <w:numPr>
           <w:ilvl w:val="0"/>
-          <w:numId w:val="27"/>
+          <w:numId w:val="28"/>
         </w:numPr>
       </w:pPr>
       <w:r>
@@ -4199,7 +4301,7 @@
         <w:spacing w:before="0" w:after="80" w:line="300" w:lineRule="auto"/>
         <w:numPr>
           <w:ilvl w:val="0"/>
-          <w:numId w:val="27"/>
+          <w:numId w:val="28"/>
         </w:numPr>
       </w:pPr>
       <w:r>
@@ -4216,7 +4318,7 @@
         <w:spacing w:before="0" w:after="80" w:line="300" w:lineRule="auto"/>
         <w:numPr>
           <w:ilvl w:val="0"/>
-          <w:numId w:val="27"/>
+          <w:numId w:val="28"/>
         </w:numPr>
       </w:pPr>
       <w:r>
@@ -4233,7 +4335,7 @@
         <w:spacing w:before="0" w:after="80" w:line="300" w:lineRule="auto"/>
         <w:numPr>
           <w:ilvl w:val="0"/>
-          <w:numId w:val="27"/>
+          <w:numId w:val="28"/>
         </w:numPr>
       </w:pPr>
       <w:r>
@@ -4912,7 +5014,7 @@
         <w:spacing w:before="0" w:after="80" w:line="300" w:lineRule="auto"/>
         <w:numPr>
           <w:ilvl w:val="0"/>
-          <w:numId w:val="28"/>
+          <w:numId w:val="29"/>
         </w:numPr>
       </w:pPr>
       <w:r>
@@ -4922,98 +5024,6 @@
           <w:sz w:val="22"/>
         </w:rPr>
         <w:t>调整曝光、对比、白平衡、阴影、中间调、亮部和彩度。</w:t>
-      </w:r>
-    </w:p>
-    <w:p>
-      <w:pPr>
-        <w:spacing w:before="0" w:after="80" w:line="300" w:lineRule="auto"/>
-        <w:numPr>
-          <w:ilvl w:val="0"/>
-          <w:numId w:val="28"/>
-        </w:numPr>
-      </w:pPr>
-      <w:r>
-        <w:rPr>
-          <w:rFonts w:ascii="Calibri" w:hAnsi="Calibri" w:eastAsia="Microsoft YaHei UI"/>
-          <w:b w:val="0"/>
-          <w:sz w:val="22"/>
-        </w:rPr>
-        <w:t>选择全图或当前选中的配对区域。</w:t>
-      </w:r>
-    </w:p>
-    <w:p>
-      <w:pPr>
-        <w:spacing w:before="0" w:after="80" w:line="300" w:lineRule="auto"/>
-        <w:numPr>
-          <w:ilvl w:val="0"/>
-          <w:numId w:val="28"/>
-        </w:numPr>
-      </w:pPr>
-      <w:r>
-        <w:rPr>
-          <w:rFonts w:ascii="Calibri" w:hAnsi="Calibri" w:eastAsia="Microsoft YaHei UI"/>
-          <w:b w:val="0"/>
-          <w:sz w:val="22"/>
-        </w:rPr>
-        <w:t>设置参考影响强度并生成预览。</w:t>
-      </w:r>
-    </w:p>
-    <w:p>
-      <w:pPr>
-        <w:spacing w:before="0" w:after="80" w:line="300" w:lineRule="auto"/>
-        <w:numPr>
-          <w:ilvl w:val="0"/>
-          <w:numId w:val="28"/>
-        </w:numPr>
-      </w:pPr>
-      <w:r>
-        <w:rPr>
-          <w:rFonts w:ascii="Calibri" w:hAnsi="Calibri" w:eastAsia="Microsoft YaHei UI"/>
-          <w:b w:val="0"/>
-          <w:sz w:val="22"/>
-        </w:rPr>
-        <w:t>使用 A/B、撤销和重做检查结果。</w:t>
-      </w:r>
-    </w:p>
-    <w:p>
-      <w:pPr>
-        <w:spacing w:before="0" w:after="80" w:line="300" w:lineRule="auto"/>
-        <w:numPr>
-          <w:ilvl w:val="0"/>
-          <w:numId w:val="28"/>
-        </w:numPr>
-      </w:pPr>
-      <w:r>
-        <w:rPr>
-          <w:rFonts w:ascii="Calibri" w:hAnsi="Calibri" w:eastAsia="Microsoft YaHei UI"/>
-          <w:b w:val="0"/>
-          <w:sz w:val="22"/>
-        </w:rPr>
-        <w:t>可导出 PNG 和 JSON 配方；符合条件时可导出 .cube。</w:t>
-      </w:r>
-    </w:p>
-    <w:p>
-      <w:r>
-        <w:rPr>
-          <w:rFonts w:ascii="Calibri" w:hAnsi="Calibri" w:eastAsia="Microsoft YaHei UI"/>
-          <w:b w:val="0"/>
-          <w:sz w:val="22"/>
-        </w:rPr>
-        <w:t>安全调色完全本地运行，不修改原图。区域调色或参考色迁移不能导出通用 .cube。</w:t>
-      </w:r>
-    </w:p>
-    <w:p>
-      <w:pPr>
-        <w:pStyle w:val="Heading2"/>
-      </w:pPr>
-      <w:r>
-        <w:rPr>
-          <w:rFonts w:ascii="Calibri" w:hAnsi="Calibri" w:eastAsia="Microsoft YaHei UI"/>
-          <w:b/>
-          <w:color w:val="2E74B5"/>
-          <w:sz w:val="26"/>
-        </w:rPr>
-        <w:t>AI 优化预演</w:t>
       </w:r>
     </w:p>
     <w:p>
@@ -5030,7 +5040,7 @@
           <w:b w:val="0"/>
           <w:sz w:val="22"/>
         </w:rPr>
-        <w:t>选择只改灯光、只改色彩或只改雾与氛围。</w:t>
+        <w:t>选择全图或当前选中的配对区域。</w:t>
       </w:r>
     </w:p>
     <w:p>
@@ -5047,7 +5057,7 @@
           <w:b w:val="0"/>
           <w:sz w:val="22"/>
         </w:rPr>
-        <w:t>设置改动预算和构图、几何、资产身份保护项。</w:t>
+        <w:t>设置参考影响强度并生成预览。</w:t>
       </w:r>
     </w:p>
     <w:p>
@@ -5064,7 +5074,7 @@
           <w:b w:val="0"/>
           <w:sz w:val="22"/>
         </w:rPr>
-        <w:t>查看发送清单并主动确认。</w:t>
+        <w:t>使用 A/B、撤销和重做检查结果。</w:t>
       </w:r>
     </w:p>
     <w:p>
@@ -5081,7 +5091,7 @@
           <w:b w:val="0"/>
           <w:sz w:val="22"/>
         </w:rPr>
-        <w:t>检查结构漂移、构图偏移和保护区变化。</w:t>
+        <w:t>可导出 PNG 和 JSON 配方；符合条件时可导出 .cube。</w:t>
       </w:r>
     </w:p>
     <w:p>
@@ -5091,21 +5101,7 @@
           <w:b w:val="0"/>
           <w:sz w:val="22"/>
         </w:rPr>
-        <w:t>AI 输出只保存为 AIConceptPreview，不会成为真实 UE Version。出现“仅适合 概念参考”时，不应把预演当作可直接复现的场景结果。</w:t>
-      </w:r>
-    </w:p>
-    <w:p>
-      <w:pPr>
-        <w:pStyle w:val="Heading1"/>
-      </w:pPr>
-      <w:r>
-        <w:rPr>
-          <w:rFonts w:ascii="Calibri" w:hAnsi="Calibri" w:eastAsia="Microsoft YaHei UI"/>
-          <w:b/>
-          <w:color w:val="2E74B5"/>
-          <w:sz w:val="32"/>
-        </w:rPr>
-        <w:t>14. 全局工具与文件安全</w:t>
+        <w:t>安全调色完全本地运行，不修改原图。区域调色或参考色迁移不能导出通用 .cube。</w:t>
       </w:r>
     </w:p>
     <w:p>
@@ -5119,7 +5115,7 @@
           <w:color w:val="2E74B5"/>
           <w:sz w:val="26"/>
         </w:rPr>
-        <w:t>项目诊断与恢复</w:t>
+        <w:t>AI 优化预演</w:t>
       </w:r>
     </w:p>
     <w:p>
@@ -5136,7 +5132,7 @@
           <w:b w:val="0"/>
           <w:sz w:val="22"/>
         </w:rPr>
-        <w:t>在首页打开“项目诊断与恢复”。</w:t>
+        <w:t>选择只改灯光、只改色彩或只改雾与氛围。</w:t>
       </w:r>
     </w:p>
     <w:p>
@@ -5153,7 +5149,7 @@
           <w:b w:val="0"/>
           <w:sz w:val="22"/>
         </w:rPr>
-        <w:t>选择或扫描最近项目，查看入口、数据库、目录、资料引用、产物和写入状态。</w:t>
+        <w:t>设置改动预算和构图、几何、资产身份保护项。</w:t>
       </w:r>
     </w:p>
     <w:p>
@@ -5170,7 +5166,7 @@
           <w:b w:val="0"/>
           <w:sz w:val="22"/>
         </w:rPr>
-        <w:t>基础目录缺失时使用“修复项目目录”；该操作不会伪造数据库或原始资料。</w:t>
+        <w:t>查看发送清单并主动确认。</w:t>
       </w:r>
     </w:p>
     <w:p>
@@ -5187,7 +5183,45 @@
           <w:b w:val="0"/>
           <w:sz w:val="22"/>
         </w:rPr>
-        <w:t>重大修改前点击“建立恢复点”。需要回退时选择恢复点并确认恢复。</w:t>
+        <w:t>检查结构漂移、构图偏移和保护区变化。</w:t>
+      </w:r>
+    </w:p>
+    <w:p>
+      <w:r>
+        <w:rPr>
+          <w:rFonts w:ascii="Calibri" w:hAnsi="Calibri" w:eastAsia="Microsoft YaHei UI"/>
+          <w:b w:val="0"/>
+          <w:sz w:val="22"/>
+        </w:rPr>
+        <w:t>AI 输出只保存为 AIConceptPreview，不会成为真实 UE Version。出现“仅适合 概念参考”时，不应把预演当作可直接复现的场景结果。</w:t>
+      </w:r>
+    </w:p>
+    <w:p>
+      <w:pPr>
+        <w:pStyle w:val="Heading1"/>
+      </w:pPr>
+      <w:r>
+        <w:rPr>
+          <w:rFonts w:ascii="Calibri" w:hAnsi="Calibri" w:eastAsia="Microsoft YaHei UI"/>
+          <w:b/>
+          <w:color w:val="2E74B5"/>
+          <w:sz w:val="32"/>
+        </w:rPr>
+        <w:t>14. 全局工具与文件安全</w:t>
+      </w:r>
+    </w:p>
+    <w:p>
+      <w:pPr>
+        <w:pStyle w:val="Heading2"/>
+      </w:pPr>
+      <w:r>
+        <w:rPr>
+          <w:rFonts w:ascii="Calibri" w:hAnsi="Calibri" w:eastAsia="Microsoft YaHei UI"/>
+          <w:b/>
+          <w:color w:val="2E74B5"/>
+          <w:sz w:val="26"/>
+        </w:rPr>
+        <w:t>项目诊断与恢复</w:t>
       </w:r>
     </w:p>
     <w:p>
@@ -5195,7 +5229,7 @@
         <w:spacing w:before="0" w:after="80" w:line="300" w:lineRule="auto"/>
         <w:numPr>
           <w:ilvl w:val="0"/>
-          <w:numId w:val="30"/>
+          <w:numId w:val="31"/>
         </w:numPr>
       </w:pPr>
       <w:r>
@@ -5204,7 +5238,7 @@
           <w:b w:val="0"/>
           <w:sz w:val="22"/>
         </w:rPr>
-        <w:t>项目被移动后使用“重定位移动项目”，指向新的入口文件。</w:t>
+        <w:t>在首页打开“项目诊断与恢复”。</w:t>
       </w:r>
     </w:p>
     <w:p>
@@ -5212,7 +5246,75 @@
         <w:spacing w:before="0" w:after="80" w:line="300" w:lineRule="auto"/>
         <w:numPr>
           <w:ilvl w:val="0"/>
-          <w:numId w:val="30"/>
+          <w:numId w:val="31"/>
+        </w:numPr>
+      </w:pPr>
+      <w:r>
+        <w:rPr>
+          <w:rFonts w:ascii="Calibri" w:hAnsi="Calibri" w:eastAsia="Microsoft YaHei UI"/>
+          <w:b w:val="0"/>
+          <w:sz w:val="22"/>
+        </w:rPr>
+        <w:t>选择或扫描最近项目，查看入口、数据库、目录、资料引用、产物和写入状态。</w:t>
+      </w:r>
+    </w:p>
+    <w:p>
+      <w:pPr>
+        <w:spacing w:before="0" w:after="80" w:line="300" w:lineRule="auto"/>
+        <w:numPr>
+          <w:ilvl w:val="0"/>
+          <w:numId w:val="31"/>
+        </w:numPr>
+      </w:pPr>
+      <w:r>
+        <w:rPr>
+          <w:rFonts w:ascii="Calibri" w:hAnsi="Calibri" w:eastAsia="Microsoft YaHei UI"/>
+          <w:b w:val="0"/>
+          <w:sz w:val="22"/>
+        </w:rPr>
+        <w:t>基础目录缺失时使用“修复项目目录”；该操作不会伪造数据库或原始资料。</w:t>
+      </w:r>
+    </w:p>
+    <w:p>
+      <w:pPr>
+        <w:spacing w:before="0" w:after="80" w:line="300" w:lineRule="auto"/>
+        <w:numPr>
+          <w:ilvl w:val="0"/>
+          <w:numId w:val="31"/>
+        </w:numPr>
+      </w:pPr>
+      <w:r>
+        <w:rPr>
+          <w:rFonts w:ascii="Calibri" w:hAnsi="Calibri" w:eastAsia="Microsoft YaHei UI"/>
+          <w:b w:val="0"/>
+          <w:sz w:val="22"/>
+        </w:rPr>
+        <w:t>重大修改前点击“建立恢复点”。需要回退时选择恢复点并确认恢复。</w:t>
+      </w:r>
+    </w:p>
+    <w:p>
+      <w:pPr>
+        <w:spacing w:before="0" w:after="80" w:line="300" w:lineRule="auto"/>
+        <w:numPr>
+          <w:ilvl w:val="0"/>
+          <w:numId w:val="31"/>
+        </w:numPr>
+      </w:pPr>
+      <w:r>
+        <w:rPr>
+          <w:rFonts w:ascii="Calibri" w:hAnsi="Calibri" w:eastAsia="Microsoft YaHei UI"/>
+          <w:b w:val="0"/>
+          <w:sz w:val="22"/>
+        </w:rPr>
+        <w:t>项目被移动后使用“重定位移动项目”，指向新的入口文件。</w:t>
+      </w:r>
+    </w:p>
+    <w:p>
+      <w:pPr>
+        <w:spacing w:before="0" w:after="80" w:line="300" w:lineRule="auto"/>
+        <w:numPr>
+          <w:ilvl w:val="0"/>
+          <w:numId w:val="31"/>
         </w:numPr>
       </w:pPr>
       <w:r>
@@ -6262,6 +6364,24 @@
   </w:abstractNum>
   <w:num w:numId="30">
     <w:abstractNumId w:val="29"/>
+  </w:num>
+  <w:abstractNum w:abstractNumId="30">
+    <w:multiLevelType w:val="singleLevel"/>
+    <w:lvl w:ilvl="0">
+      <w:start w:val="1"/>
+      <w:numFmt w:val="decimal"/>
+      <w:lvlText w:val="%1."/>
+      <w:lvlJc w:val="left"/>
+      <w:pPr>
+        <w:tabs>
+          <w:tab w:val="num" w:pos="540"/>
+        </w:tabs>
+        <w:ind w:left="540" w:hanging="270"/>
+      </w:pPr>
+    </w:lvl>
+  </w:abstractNum>
+  <w:num w:numId="31">
+    <w:abstractNumId w:val="30"/>
   </w:num>
 </w:numbering>
 </file>

</xml_diff>

<commit_message>
feat: unify workspace navigation and expand vision providers
</commit_message>
<xml_diff>
--- a/GATalk_使用手册.docx
+++ b/GATalk_使用手册.docx
@@ -23,7 +23,7 @@
           <w:b w:val="0"/>
           <w:sz w:val="22"/>
         </w:rPr>
-        <w:t>适用版本：0.17.0（全局语言系统） 更新日期：2026-08-12</w:t>
+        <w:t>适用版本：0.18.0（统一导航与视觉供应商扩展） 更新日期：2026-08-12</w:t>
       </w:r>
     </w:p>
     <w:p>
@@ -214,7 +214,7 @@
           <w:b w:val="0"/>
           <w:sz w:val="22"/>
         </w:rPr>
-        <w:t>“审阅任务与质量门禁中心”位于平台层，统一管理跨项目任务和版本验收。</w:t>
+        <w:t>“制作任务与验收中心”位于平台层，统一管理跨项目任务和版本验收。</w:t>
       </w:r>
     </w:p>
     <w:p>
@@ -231,7 +231,24 @@
           <w:b w:val="0"/>
           <w:sz w:val="22"/>
         </w:rPr>
-        <w:t>每个专业工作台顶部都有固定的“工作台首页”大按钮，旁边是 全局检索、任务中心和全局设置。模块自己的导入和分析工具在下一行。</w:t>
+        <w:t>每个专业工作台左上方只显示一个“工作台首页”按钮，旁边是全局检索、运行状态 和全局设置。模块自己的导入和分析工具在下一行。</w:t>
+      </w:r>
+    </w:p>
+    <w:p>
+      <w:pPr>
+        <w:spacing w:before="0" w:after="80" w:line="300" w:lineRule="auto"/>
+        <w:numPr>
+          <w:ilvl w:val="0"/>
+          <w:numId w:val="10"/>
+        </w:numPr>
+      </w:pPr>
+      <w:r>
+        <w:rPr>
+          <w:rFonts w:ascii="Calibri" w:hAnsi="Calibri" w:eastAsia="Microsoft YaHei UI"/>
+          <w:b w:val="0"/>
+          <w:sz w:val="22"/>
+        </w:rPr>
+        <w:t>在首页与工作台之间切换时，GATalk 保持当前普通、最大化或全屏状态；用户没有 调整窗口时，软件不会自行改变大小。</w:t>
       </w:r>
     </w:p>
     <w:p>
@@ -381,7 +398,7 @@
           <w:b w:val="0"/>
           <w:sz w:val="22"/>
         </w:rPr>
-        <w:t>输入项目、Shot、资料、作品研究、资产、生产规格、任务或门禁名称。</w:t>
+        <w:t>输入项目、Shot、资料、作品研究、资产、生产规格、任务或验收标准名称。</w:t>
       </w:r>
     </w:p>
     <w:p>
@@ -981,7 +998,7 @@
           <w:b w:val="0"/>
           <w:sz w:val="22"/>
         </w:rPr>
-        <w:t>在“专家对照”选择 AI 供应商，查看发送清单并主动确认。</w:t>
+        <w:t>在“AI 对照研究”选择供应商，查看发送清单并主动确认。</w:t>
       </w:r>
     </w:p>
     <w:p>
@@ -1114,7 +1131,7 @@
           <w:color w:val="2E74B5"/>
           <w:sz w:val="32"/>
         </w:rPr>
-        <w:t>5. 审阅任务与质量门禁中心</w:t>
+        <w:t>5. 制作任务与验收中心</w:t>
       </w:r>
     </w:p>
     <w:p>
@@ -1162,7 +1179,7 @@
           <w:b w:val="0"/>
           <w:sz w:val="22"/>
         </w:rPr>
-        <w:t>点击“加入审阅中心”。只有用户主动选择的内容会进入中心。</w:t>
+        <w:t>点击“加入制作任务”。只有用户主动选择的内容会进入中心。</w:t>
       </w:r>
     </w:p>
     <w:p>
@@ -1179,7 +1196,7 @@
           <w:b w:val="0"/>
           <w:sz w:val="22"/>
         </w:rPr>
-        <w:t>返回工作台首页，进入“审阅任务与质量门禁中心”。</w:t>
+        <w:t>返回工作台首页，进入“制作任务与验收中心”。</w:t>
       </w:r>
     </w:p>
     <w:p>
@@ -1240,7 +1257,7 @@
           <w:b w:val="0"/>
           <w:sz w:val="22"/>
         </w:rPr>
-        <w:t>重复加入同一个来源对象时不会建立第二条任务。审阅中心不复制原图，也不会 反向修改来源项目；删除中心任务不会删除专业项目中的分析或资产。</w:t>
+        <w:t>重复加入同一个来源对象时不会建立第二条任务。制作任务中心不复制原图，也不会 反向修改来源项目；删除中心任务不会删除专业项目中的分析或资产。</w:t>
       </w:r>
     </w:p>
     <w:p>
@@ -1418,7 +1435,7 @@
           <w:color w:val="2E74B5"/>
           <w:sz w:val="26"/>
         </w:rPr>
-        <w:t>设置质量门禁</w:t>
+        <w:t>设置验收标准</w:t>
       </w:r>
     </w:p>
     <w:p>
@@ -1435,7 +1452,7 @@
           <w:b w:val="0"/>
           <w:sz w:val="22"/>
         </w:rPr>
-        <w:t>打开“质量门禁”页，点击“新建质量门禁”。</w:t>
+        <w:t>打开“验收标准”页，点击“新建验收标准”。</w:t>
       </w:r>
     </w:p>
     <w:p>
@@ -1452,7 +1469,7 @@
           <w:b w:val="0"/>
           <w:sz w:val="22"/>
         </w:rPr>
-        <w:t>填写门禁名称、维度、所属项目和明确的验收条件。</w:t>
+        <w:t>填写名称、审阅维度、所属项目和明确的验收条件。</w:t>
       </w:r>
     </w:p>
     <w:p>
@@ -1469,7 +1486,7 @@
           <w:b w:val="0"/>
           <w:sz w:val="22"/>
         </w:rPr>
-        <w:t>决定它是否为必需门禁并保存。</w:t>
+        <w:t>决定它是否为必需标准并保存。</w:t>
       </w:r>
     </w:p>
     <w:p>
@@ -1503,17 +1520,17 @@
           <w:b w:val="0"/>
           <w:sz w:val="22"/>
         </w:rPr>
-        <w:t>需要快速建立基线时，选择制作阶段和项目，点击“应用阶段门禁模板”。</w:t>
-      </w:r>
-    </w:p>
-    <w:p>
-      <w:r>
-        <w:rPr>
-          <w:rFonts w:ascii="Calibri" w:hAnsi="Calibri" w:eastAsia="Microsoft YaHei UI"/>
-          <w:b w:val="0"/>
-          <w:sz w:val="22"/>
-        </w:rPr>
-        <w:t>质量门禁由用户定义。GATalk 不用综合分数代替判断，也不会把 AI 结论自动标记 为人工验收通过。</w:t>
+        <w:t>需要快速建立基线时，选择制作阶段和项目，点击“应用阶段验收模板”。</w:t>
+      </w:r>
+    </w:p>
+    <w:p>
+      <w:r>
+        <w:rPr>
+          <w:rFonts w:ascii="Calibri" w:hAnsi="Calibri" w:eastAsia="Microsoft YaHei UI"/>
+          <w:b w:val="0"/>
+          <w:sz w:val="22"/>
+        </w:rPr>
+        <w:t>验收标准由用户定义。GATalk 不用综合分数代替判断，也不会把 AI 结论自动标记 为人工验收通过。</w:t>
       </w:r>
     </w:p>
     <w:p>
@@ -1643,7 +1660,7 @@
           <w:b w:val="0"/>
           <w:sz w:val="22"/>
         </w:rPr>
-        <w:t>在“专家拆解”选择视觉 AI，查看发送清单后主动确认。</w:t>
+        <w:t>在“作品解读”选择视觉 AI，查看发送清单后主动确认。</w:t>
       </w:r>
     </w:p>
     <w:p>
@@ -1660,7 +1677,7 @@
           <w:b w:val="0"/>
           <w:sz w:val="22"/>
         </w:rPr>
-        <w:t>阅读十二维拆解和跨维度因果链。</w:t>
+        <w:t>阅读十二项分析内容和跨项目因果关系。</w:t>
       </w:r>
     </w:p>
     <w:p>
@@ -1800,7 +1817,7 @@
           <w:color w:val="2E74B5"/>
           <w:sz w:val="26"/>
         </w:rPr>
-        <w:t>AI 专家拆解</w:t>
+        <w:t>AI 作品解读</w:t>
       </w:r>
     </w:p>
     <w:p>
@@ -4225,7 +4242,7 @@
           <w:color w:val="2E74B5"/>
           <w:sz w:val="32"/>
         </w:rPr>
-        <w:t>12. AI 审阅与灯光审片</w:t>
+        <w:t>12. 美术审阅与灯光审片</w:t>
       </w:r>
     </w:p>
     <w:p>
@@ -4242,7 +4259,7 @@
           <w:b w:val="0"/>
           <w:sz w:val="22"/>
         </w:rPr>
-        <w:t>优先选择“深度主美审阅（八维）”；专项灯光问题选择“灯光专项审阅”。</w:t>
+        <w:t>全面检查画面时选择“综合美术审阅”；只检查灯光时选择“场景灯光审阅”。</w:t>
       </w:r>
     </w:p>
     <w:p>
@@ -4368,7 +4385,7 @@
           <w:color w:val="2E74B5"/>
           <w:sz w:val="26"/>
         </w:rPr>
-        <w:t>深度主美审阅</w:t>
+        <w:t>视觉 AI 供应商</w:t>
       </w:r>
     </w:p>
     <w:p>
@@ -4385,7 +4402,7 @@
           <w:b w:val="0"/>
           <w:sz w:val="22"/>
         </w:rPr>
-        <w:t>八个维度：构图、视觉引导、焦点层级、色彩、明度、灯光、材质、世界设计。</w:t>
+        <w:t>当前可选：阿里云百炼、SiliconFlow、智谱 GLM、火山方舟、腾讯混元、OpenAI、 Anthropic Claude、Google Gemini 和 xAI Grok。</w:t>
       </w:r>
     </w:p>
     <w:p>
@@ -4402,7 +4419,7 @@
           <w:b w:val="0"/>
           <w:sz w:val="22"/>
         </w:rPr>
-        <w:t>每个维度分开显示制作目标、参考呈现、当前效果、优点、风险和不确定性。</w:t>
+        <w:t>模型 ID 可编辑。默认值依据当前公开接口设置；实际权限、地域、额度和费用以 供应商账户控制台为准。</w:t>
       </w:r>
     </w:p>
     <w:p>
@@ -4419,7 +4436,7 @@
           <w:b w:val="0"/>
           <w:sz w:val="22"/>
         </w:rPr>
-        <w:t>最多五个核心问题，并给出保留项、UE 执行顺序和下一版验证方法。</w:t>
+        <w:t>图片生成仍使用万相、Gemini / Nano Banana、OpenAI GPT Image 和 Grok Imagine。只支持文字或视觉审阅的服务不会出现在图片生成位置。</w:t>
       </w:r>
     </w:p>
     <w:p>
@@ -4436,7 +4453,7 @@
           <w:b w:val="0"/>
           <w:sz w:val="22"/>
         </w:rPr>
-        <w:t>“本地证据”显示测量支持、部分支持、存在冲突或无法验证。冲突不会被隐藏。</w:t>
+        <w:t>软件不会自动把请求转发到另一家供应商。每次真实联网都要先查看发送清单并确认。</w:t>
       </w:r>
     </w:p>
     <w:p>
@@ -4453,7 +4470,7 @@
           <w:b w:val="0"/>
           <w:sz w:val="22"/>
         </w:rPr>
-        <w:t>离线 Mock 只验证界面和 JSON 流程，不会在本地分析图片，也不代表真实审阅。</w:t>
+        <w:t>离线 Mock 只验证界面、请求和保存流程，不包含本地视觉模型，不依赖显卡。</w:t>
       </w:r>
     </w:p>
     <w:p>
@@ -4467,7 +4484,7 @@
           <w:color w:val="2E74B5"/>
           <w:sz w:val="26"/>
         </w:rPr>
-        <w:t>灯光专项审阅</w:t>
+        <w:t>综合美术审阅</w:t>
       </w:r>
     </w:p>
     <w:p>
@@ -4484,7 +4501,7 @@
           <w:b w:val="0"/>
           <w:sz w:val="22"/>
         </w:rPr>
-        <w:t>分为曝光与明度范围、主光与填充、焦点层级、空间分离、冷暖组织、 阴影与剪影、雾与体积效果、游戏可读性八个维度。</w:t>
+        <w:t>审阅项目包括构图、视觉引导、焦点层级、色彩、明度、灯光、材质和世界设计。</w:t>
       </w:r>
     </w:p>
     <w:p>
@@ -4501,7 +4518,7 @@
           <w:b w:val="0"/>
           <w:sz w:val="22"/>
         </w:rPr>
-        <w:t>每个维度分别说明目标、参考做法、当前效果、证据、已有优点、风险和不确定性。</w:t>
+        <w:t>每个维度分开显示制作目标、参考呈现、当前效果、优点、风险和不确定性。</w:t>
       </w:r>
     </w:p>
     <w:p>
@@ -4518,7 +4535,7 @@
           <w:b w:val="0"/>
           <w:sz w:val="22"/>
         </w:rPr>
-        <w:t>忠于参考、强化戏剧性和优先游戏可读性三套方案可查看完整策略、UE5.3 执行顺序、风险和验证方法。</w:t>
+        <w:t>最多五个核心问题，并给出保留项、UE 执行顺序和下一版验证方法。</w:t>
       </w:r>
     </w:p>
     <w:p>
@@ -4535,21 +4552,7 @@
           <w:b w:val="0"/>
           <w:sz w:val="22"/>
         </w:rPr>
-        <w:t>没有 UE 工程参数时，性能部分只给检查清单，不伪造 Lux、EV、Actor 数量或性能收益。</w:t>
-      </w:r>
-    </w:p>
-    <w:p>
-      <w:pPr>
-        <w:pStyle w:val="Heading2"/>
-      </w:pPr>
-      <w:r>
-        <w:rPr>
-          <w:rFonts w:ascii="Calibri" w:hAnsi="Calibri" w:eastAsia="Microsoft YaHei UI"/>
-          <w:b/>
-          <w:color w:val="2E74B5"/>
-          <w:sz w:val="26"/>
-        </w:rPr>
-        <w:t>AI 审阅历史</w:t>
+        <w:t>“本地证据”显示测量支持、部分支持、存在冲突或无法验证。冲突不会被隐藏。</w:t>
       </w:r>
     </w:p>
     <w:p>
@@ -4566,7 +4569,21 @@
           <w:b w:val="0"/>
           <w:sz w:val="22"/>
         </w:rPr>
-        <w:t>场景审阅按 Shot 和 Version 保存；作品研究和作品对照也会保存每次完成结果。</w:t>
+        <w:t>离线 Mock 只验证界面和 JSON 流程，不会在本地分析图片，也不代表真实审阅。</w:t>
+      </w:r>
+    </w:p>
+    <w:p>
+      <w:pPr>
+        <w:pStyle w:val="Heading2"/>
+      </w:pPr>
+      <w:r>
+        <w:rPr>
+          <w:rFonts w:ascii="Calibri" w:hAnsi="Calibri" w:eastAsia="Microsoft YaHei UI"/>
+          <w:b/>
+          <w:color w:val="2E74B5"/>
+          <w:sz w:val="26"/>
+        </w:rPr>
+        <w:t>场景灯光审阅</w:t>
       </w:r>
     </w:p>
     <w:p>
@@ -4583,7 +4600,7 @@
           <w:b w:val="0"/>
           <w:sz w:val="22"/>
         </w:rPr>
-        <w:t>页面默认显示最新结果。选择历史记录可查看旧版，也可单独删除。</w:t>
+        <w:t>分析曝光与明度范围、主光与填充、焦点层级、空间分离、冷暖组织、 阴影与剪影、雾与体积效果以及游戏可读性。</w:t>
       </w:r>
     </w:p>
     <w:p>
@@ -4600,21 +4617,7 @@
           <w:b w:val="0"/>
           <w:sz w:val="22"/>
         </w:rPr>
-        <w:t>删除审阅记录不会删除由用户已确认的任务、证据或个人笔记。</w:t>
-      </w:r>
-    </w:p>
-    <w:p>
-      <w:pPr>
-        <w:pStyle w:val="Heading2"/>
-      </w:pPr>
-      <w:r>
-        <w:rPr>
-          <w:rFonts w:ascii="Calibri" w:hAnsi="Calibri" w:eastAsia="Microsoft YaHei UI"/>
-          <w:b/>
-          <w:color w:val="2E74B5"/>
-          <w:sz w:val="26"/>
-        </w:rPr>
-        <w:t>AI 接口失败时</w:t>
+        <w:t>每个维度分别说明目标、参考做法、当前效果、证据、已有优点、风险和不确定性。</w:t>
       </w:r>
     </w:p>
     <w:p>
@@ -4631,7 +4634,7 @@
           <w:b w:val="0"/>
           <w:sz w:val="22"/>
         </w:rPr>
-        <w:t>connection_closed：远端或中间网络设备提前断开连接，不表示 API Key 错误。新版会自动退避重试 3 次；仍失败时检查代理、VPN 和网络稳定性。</w:t>
+        <w:t>忠于参考、强化戏剧性和优先游戏可读性三套方案可查看完整策略、UE5.3 执行顺序、风险和验证方法。</w:t>
       </w:r>
     </w:p>
     <w:p>
@@ -4648,7 +4651,21 @@
           <w:b w:val="0"/>
           <w:sz w:val="22"/>
         </w:rPr>
-        <w:t>自动重试可能重复提交同一请求并产生额外费用，发送确认窗口会提前提示。</w:t>
+        <w:t>没有 UE 工程参数时，性能部分只给检查清单，不伪造 Lux、EV、Actor 数量或性能收益。</w:t>
+      </w:r>
+    </w:p>
+    <w:p>
+      <w:pPr>
+        <w:pStyle w:val="Heading2"/>
+      </w:pPr>
+      <w:r>
+        <w:rPr>
+          <w:rFonts w:ascii="Calibri" w:hAnsi="Calibri" w:eastAsia="Microsoft YaHei UI"/>
+          <w:b/>
+          <w:color w:val="2E74B5"/>
+          <w:sz w:val="26"/>
+        </w:rPr>
+        <w:t>AI 审阅历史</w:t>
       </w:r>
     </w:p>
     <w:p>
@@ -4665,7 +4682,7 @@
           <w:b w:val="0"/>
           <w:sz w:val="22"/>
         </w:rPr>
-        <w:t>http_400：请求参数或模型不兼容。新版会自动处理 Gemini 深度审阅的复杂 Schema；仍失败时先确认正在运行 0.5.0a4，再恢复默认模型重试。</w:t>
+        <w:t>场景审阅按 Shot 和 Version 保存；作品研究和作品对照也会保存每次完成结果。</w:t>
       </w:r>
     </w:p>
     <w:p>
@@ -4682,7 +4699,7 @@
           <w:b w:val="0"/>
           <w:sz w:val="22"/>
         </w:rPr>
-        <w:t>若错误包含 generation_config.response_format.text.mime_type，说明仍在运行 旧版；关闭旧程序后改用本次 Gemini 接口修正版。</w:t>
+        <w:t>页面默认显示最新结果。选择历史记录可查看旧版，也可单独删除。</w:t>
       </w:r>
     </w:p>
     <w:p>
@@ -4699,7 +4716,21 @@
           <w:b w:val="0"/>
           <w:sz w:val="22"/>
         </w:rPr>
-        <w:t>Gemini 首次返回的 JSON 语法损坏、被截断或结构不完整时，GATalk 最多 自动纠错一次。确认发送窗口会提示该过程可能再次发送同一审阅副本并增加 少量费用。</w:t>
+        <w:t>删除审阅记录不会删除由用户已确认的任务、证据或个人笔记。</w:t>
+      </w:r>
+    </w:p>
+    <w:p>
+      <w:pPr>
+        <w:pStyle w:val="Heading2"/>
+      </w:pPr>
+      <w:r>
+        <w:rPr>
+          <w:rFonts w:ascii="Calibri" w:hAnsi="Calibri" w:eastAsia="Microsoft YaHei UI"/>
+          <w:b/>
+          <w:color w:val="2E74B5"/>
+          <w:sz w:val="26"/>
+        </w:rPr>
+        <w:t>AI 接口失败时</w:t>
       </w:r>
     </w:p>
     <w:p>
@@ -4716,7 +4747,7 @@
           <w:b w:val="0"/>
           <w:sz w:val="22"/>
         </w:rPr>
-        <w:t>finish_reason=MAX_TOKENS：AI 回答过长导致 JSON 尾部被截断，不表示 API Key 错误。新版会压缩内容，并只在明确截断时用更高预算纠错一次。</w:t>
+        <w:t>connection_closed：远端或中间网络设备提前断开连接，不表示 API Key 错误。新版会自动退避重试 3 次；仍失败时检查代理、VPN 和网络稳定性。</w:t>
       </w:r>
     </w:p>
     <w:p>
@@ -4733,7 +4764,7 @@
           <w:b w:val="0"/>
           <w:sz w:val="22"/>
         </w:rPr>
-        <w:t>错误中的 line 和 column 表示 AI 返回文本的 JSON 损坏位置，不表示 API Key 错误。0.5.0a4 会把原始返回交给同一模型压缩并修复；第二次仍损坏时 停止，不会无限重试。</w:t>
+        <w:t>自动重试可能重复提交同一请求并产生额外费用，发送确认窗口会提前提示。</w:t>
       </w:r>
     </w:p>
     <w:p>
@@ -4750,7 +4781,7 @@
           <w:b w:val="0"/>
           <w:sz w:val="22"/>
         </w:rPr>
-        <w:t>若 AI 引用了本次报告中不存在的问题 ID，0.5.0a3 会取消无效链接并继续 显示完整报告，不追加 API 调用。界面的“结构修复”只表示链接已取消，正文 和真实问题没有被改写。</w:t>
+        <w:t>http_400：请求参数、模型或结构化输出模式不兼容。先恢复该供应商的默认模型； 仍失败时保存脱敏错误详情并核对供应商模型文档。</w:t>
       </w:r>
     </w:p>
     <w:p>
@@ -4767,7 +4798,7 @@
           <w:b w:val="0"/>
           <w:sz w:val="22"/>
         </w:rPr>
-        <w:t>http_401：Key 错误、过期或不属于该供应商。</w:t>
+        <w:t>若错误包含 generation_config.response_format.text.mime_type，说明正在运行旧版 Gemini 接口实现；关闭旧程序后使用当前候选版本。</w:t>
       </w:r>
     </w:p>
     <w:p>
@@ -4784,7 +4815,7 @@
           <w:b w:val="0"/>
           <w:sz w:val="22"/>
         </w:rPr>
-        <w:t>http_403：检查模型权限、服务开通、地域和 Key 所属工作区。</w:t>
+        <w:t>Gemini 首次返回的 JSON 语法损坏、被截断或结构不完整时，GATalk 最多 自动纠错一次。确认发送窗口会提示该过程可能再次发送同一审阅副本并增加 少量费用。</w:t>
       </w:r>
     </w:p>
     <w:p>
@@ -4801,7 +4832,7 @@
           <w:b w:val="0"/>
           <w:sz w:val="22"/>
         </w:rPr>
-        <w:t>http_404：模型 ID 已下线或接口不存在。Gemini 会按发送清单自动尝试 当前备用链；其他供应商请改回其默认模型。</w:t>
+        <w:t>finish_reason=MAX_TOKENS：AI 回答过长导致 JSON 尾部被截断，不表示 API Key 错误。新版会压缩内容，并只在明确截断时用更高预算纠错一次。</w:t>
       </w:r>
     </w:p>
     <w:p>
@@ -4818,7 +4849,7 @@
           <w:b w:val="0"/>
           <w:sz w:val="22"/>
         </w:rPr>
-        <w:t>http_413：降低发送分辨率后重试。</w:t>
+        <w:t>错误中的 line 和 column 表示 AI 返回文本的 JSON 损坏位置，不表示 API Key 错误。GATalk 会进行一次同模型结构修复；第二次仍损坏时停止。</w:t>
       </w:r>
     </w:p>
     <w:p>
@@ -4835,7 +4866,7 @@
           <w:b w:val="0"/>
           <w:sz w:val="22"/>
         </w:rPr>
-        <w:t>http_429：额度不足或调用过快。</w:t>
+        <w:t>若 AI 引用了本次报告中不存在的问题 ID，GATalk 会取消无效链接并继续 显示完整报告，不追加 API 调用。界面的“结构修复”只表示链接已取消，正文 和真实问题没有被改写。</w:t>
       </w:r>
     </w:p>
     <w:p>
@@ -4852,7 +4883,7 @@
           <w:b w:val="0"/>
           <w:sz w:val="22"/>
         </w:rPr>
-        <w:t>http_503：供应商当前模型临时过载，不表示 API Key 错误。新版先有限重试； Gemini 仍失败时会按发送清单依次尝试 gemini-3.5-flash 和 gemini-3.5-flash-lite，不会再使用 gemini-2.5-flash。</w:t>
+        <w:t>http_401：Key 错误、过期或不属于该供应商。</w:t>
       </w:r>
     </w:p>
     <w:p>
@@ -4869,7 +4900,7 @@
           <w:b w:val="0"/>
           <w:sz w:val="22"/>
         </w:rPr>
-        <w:t>发送清单会提前显示完整备用链。若发生回退，状态栏和保存记录会显示请求 模型、实际模型及回退原因；每次实际发送都可能产生调用费用。</w:t>
+        <w:t>http_403：检查模型权限、服务开通、地域和 Key 所属工作区。</w:t>
       </w:r>
     </w:p>
     <w:p>
@@ -4886,45 +4917,7 @@
           <w:b w:val="0"/>
           <w:sz w:val="22"/>
         </w:rPr>
-        <w:t>其他 http_5xx：供应商服务异常，稍后重试。</w:t>
-      </w:r>
-    </w:p>
-    <w:p>
-      <w:r>
-        <w:rPr>
-          <w:rFonts w:ascii="Calibri" w:hAnsi="Calibri" w:eastAsia="Microsoft YaHei UI"/>
-          <w:b w:val="0"/>
-          <w:sz w:val="22"/>
-        </w:rPr>
-        <w:t>错误窗口只显示供应商返回的脱敏原因。不要把 API Key 截图或复制给他人。</w:t>
-      </w:r>
-    </w:p>
-    <w:p>
-      <w:pPr>
-        <w:pStyle w:val="Heading1"/>
-      </w:pPr>
-      <w:r>
-        <w:rPr>
-          <w:rFonts w:ascii="Calibri" w:hAnsi="Calibri" w:eastAsia="Microsoft YaHei UI"/>
-          <w:b/>
-          <w:color w:val="2E74B5"/>
-          <w:sz w:val="32"/>
-        </w:rPr>
-        <w:t>13. 优化实验室</w:t>
-      </w:r>
-    </w:p>
-    <w:p>
-      <w:pPr>
-        <w:pStyle w:val="Heading2"/>
-      </w:pPr>
-      <w:r>
-        <w:rPr>
-          <w:rFonts w:ascii="Calibri" w:hAnsi="Calibri" w:eastAsia="Microsoft YaHei UI"/>
-          <w:b/>
-          <w:color w:val="2E74B5"/>
-          <w:sz w:val="26"/>
-        </w:rPr>
-        <w:t>目标匹配画像</w:t>
+        <w:t>http_404：模型 ID 已下线或接口不存在。Gemini 会按发送清单自动尝试 当前备用链；其他供应商请改回其默认模型。</w:t>
       </w:r>
     </w:p>
     <w:p>
@@ -4941,7 +4934,7 @@
           <w:b w:val="0"/>
           <w:sz w:val="22"/>
         </w:rPr>
-        <w:t>显示明度、黑白灰、色板、彩度、冷暖、区域关系等维度。</w:t>
+        <w:t>http_413：降低发送分辨率后重试。</w:t>
       </w:r>
     </w:p>
     <w:p>
@@ -4958,7 +4951,7 @@
           <w:b w:val="0"/>
           <w:sz w:val="22"/>
         </w:rPr>
-        <w:t>可修改各维度权重。</w:t>
+        <w:t>http_429：额度不足或调用过快。</w:t>
       </w:r>
     </w:p>
     <w:p>
@@ -4975,7 +4968,7 @@
           <w:b w:val="0"/>
           <w:sz w:val="22"/>
         </w:rPr>
-        <w:t>“估计匹配度”只代表当前算法和权重，不是作品质量评分。</w:t>
+        <w:t>http_503：供应商当前模型临时过载，不表示 API Key 错误。新版先有限重试； Gemini 仍失败时会按发送清单依次尝试 gemini-3.5-flash 和 gemini-3.5-flash-lite，不会再使用 gemini-2.5-flash。</w:t>
       </w:r>
     </w:p>
     <w:p>
@@ -4992,6 +4985,129 @@
           <w:b w:val="0"/>
           <w:sz w:val="22"/>
         </w:rPr>
+        <w:t>发送清单会提前显示完整备用链。若发生回退，状态栏和保存记录会显示请求 模型、实际模型及回退原因；每次实际发送都可能产生调用费用。</w:t>
+      </w:r>
+    </w:p>
+    <w:p>
+      <w:pPr>
+        <w:spacing w:before="0" w:after="80" w:line="300" w:lineRule="auto"/>
+        <w:numPr>
+          <w:ilvl w:val="0"/>
+          <w:numId w:val="10"/>
+        </w:numPr>
+      </w:pPr>
+      <w:r>
+        <w:rPr>
+          <w:rFonts w:ascii="Calibri" w:hAnsi="Calibri" w:eastAsia="Microsoft YaHei UI"/>
+          <w:b w:val="0"/>
+          <w:sz w:val="22"/>
+        </w:rPr>
+        <w:t>其他 http_5xx：供应商服务异常，稍后重试。</w:t>
+      </w:r>
+    </w:p>
+    <w:p>
+      <w:r>
+        <w:rPr>
+          <w:rFonts w:ascii="Calibri" w:hAnsi="Calibri" w:eastAsia="Microsoft YaHei UI"/>
+          <w:b w:val="0"/>
+          <w:sz w:val="22"/>
+        </w:rPr>
+        <w:t>错误窗口只显示供应商返回的脱敏原因。不要把 API Key 截图或复制给他人。</w:t>
+      </w:r>
+    </w:p>
+    <w:p>
+      <w:pPr>
+        <w:pStyle w:val="Heading1"/>
+      </w:pPr>
+      <w:r>
+        <w:rPr>
+          <w:rFonts w:ascii="Calibri" w:hAnsi="Calibri" w:eastAsia="Microsoft YaHei UI"/>
+          <w:b/>
+          <w:color w:val="2E74B5"/>
+          <w:sz w:val="32"/>
+        </w:rPr>
+        <w:t>13. 优化实验室</w:t>
+      </w:r>
+    </w:p>
+    <w:p>
+      <w:pPr>
+        <w:pStyle w:val="Heading2"/>
+      </w:pPr>
+      <w:r>
+        <w:rPr>
+          <w:rFonts w:ascii="Calibri" w:hAnsi="Calibri" w:eastAsia="Microsoft YaHei UI"/>
+          <w:b/>
+          <w:color w:val="2E74B5"/>
+          <w:sz w:val="26"/>
+        </w:rPr>
+        <w:t>目标匹配画像</w:t>
+      </w:r>
+    </w:p>
+    <w:p>
+      <w:pPr>
+        <w:spacing w:before="0" w:after="80" w:line="300" w:lineRule="auto"/>
+        <w:numPr>
+          <w:ilvl w:val="0"/>
+          <w:numId w:val="10"/>
+        </w:numPr>
+      </w:pPr>
+      <w:r>
+        <w:rPr>
+          <w:rFonts w:ascii="Calibri" w:hAnsi="Calibri" w:eastAsia="Microsoft YaHei UI"/>
+          <w:b w:val="0"/>
+          <w:sz w:val="22"/>
+        </w:rPr>
+        <w:t>显示明度、黑白灰、色板、彩度、冷暖、区域关系等维度。</w:t>
+      </w:r>
+    </w:p>
+    <w:p>
+      <w:pPr>
+        <w:spacing w:before="0" w:after="80" w:line="300" w:lineRule="auto"/>
+        <w:numPr>
+          <w:ilvl w:val="0"/>
+          <w:numId w:val="10"/>
+        </w:numPr>
+      </w:pPr>
+      <w:r>
+        <w:rPr>
+          <w:rFonts w:ascii="Calibri" w:hAnsi="Calibri" w:eastAsia="Microsoft YaHei UI"/>
+          <w:b w:val="0"/>
+          <w:sz w:val="22"/>
+        </w:rPr>
+        <w:t>可修改各维度权重。</w:t>
+      </w:r>
+    </w:p>
+    <w:p>
+      <w:pPr>
+        <w:spacing w:before="0" w:after="80" w:line="300" w:lineRule="auto"/>
+        <w:numPr>
+          <w:ilvl w:val="0"/>
+          <w:numId w:val="10"/>
+        </w:numPr>
+      </w:pPr>
+      <w:r>
+        <w:rPr>
+          <w:rFonts w:ascii="Calibri" w:hAnsi="Calibri" w:eastAsia="Microsoft YaHei UI"/>
+          <w:b w:val="0"/>
+          <w:sz w:val="22"/>
+        </w:rPr>
+        <w:t>“估计匹配度”只代表当前算法和权重，不是作品质量评分。</w:t>
+      </w:r>
+    </w:p>
+    <w:p>
+      <w:pPr>
+        <w:spacing w:before="0" w:after="80" w:line="300" w:lineRule="auto"/>
+        <w:numPr>
+          <w:ilvl w:val="0"/>
+          <w:numId w:val="10"/>
+        </w:numPr>
+      </w:pPr>
+      <w:r>
+        <w:rPr>
+          <w:rFonts w:ascii="Calibri" w:hAnsi="Calibri" w:eastAsia="Microsoft YaHei UI"/>
+          <w:b w:val="0"/>
+          <w:sz w:val="22"/>
+        </w:rPr>
         <w:t>证据不足的维度会明确标出，不会自动猜测。</w:t>
       </w:r>
     </w:p>
@@ -5367,7 +5483,7 @@
           <w:b w:val="0"/>
           <w:sz w:val="22"/>
         </w:rPr>
-        <w:t>Ctrl+Shift+J 打开任务与供应商状态，查看 AI 调用、重试和失败原因。</w:t>
+        <w:t>Ctrl+Shift+J 打开运行状态，查看 AI 调用、重试和失败原因。</w:t>
       </w:r>
     </w:p>
     <w:p>

</xml_diff>

<commit_message>
release: prepare GATalk 0.18.1 beta 1
</commit_message>
<xml_diff>
--- a/GATalk_使用手册.docx
+++ b/GATalk_使用手册.docx
@@ -23,7 +23,7 @@
           <w:b w:val="0"/>
           <w:sz w:val="22"/>
         </w:rPr>
-        <w:t>适用版本：0.18.0；更新日期：2026-08-12</w:t>
+        <w:t>适用版本：0.18.1 Beta 1；更新日期：2026-08-14</w:t>
       </w:r>
     </w:p>
     <w:p>
@@ -74,7 +74,24 @@
           <w:b w:val="0"/>
           <w:sz w:val="22"/>
         </w:rPr>
-        <w:t>发布版运行 GATalk/GATalk.exe；开发版运行 start_dev.cmd。</w:t>
+        <w:t>从 GitHub Releases 下载 Windows x64 测试版并完整解压。</w:t>
+      </w:r>
+    </w:p>
+    <w:p>
+      <w:pPr>
+        <w:spacing w:before="0" w:after="80" w:line="300" w:lineRule="auto"/>
+        <w:numPr>
+          <w:ilvl w:val="0"/>
+          <w:numId w:val="11"/>
+        </w:numPr>
+      </w:pPr>
+      <w:r>
+        <w:rPr>
+          <w:rFonts w:ascii="Calibri" w:hAnsi="Calibri" w:eastAsia="Microsoft YaHei UI"/>
+          <w:b w:val="0"/>
+          <w:sz w:val="22"/>
+        </w:rPr>
+        <w:t>运行 GATalk/GATalk.exe；开发者可运行 start_dev.cmd。</w:t>
       </w:r>
     </w:p>
     <w:p>
@@ -184,7 +201,7 @@
           <w:b w:val="0"/>
           <w:sz w:val="22"/>
         </w:rPr>
-        <w:t>注意：导入图片始终只读。软件不会自动联网或上传内容。</w:t>
+        <w:t>注意：当前测试版未签名。Windows 首次启动若显示保护提示，应先在 Release 页面核对 压缩包 SHA-256。导入图片始终只读，软件不会自动联网或上传内容。</w:t>
       </w:r>
     </w:p>
     <w:p>
@@ -1422,6 +1439,91 @@
         <w:t>文件安全：原图保留原始字节，分析产物和导出文件分开保存；同一项目只允许一个进程写入。保存失败不会覆盖原图，迁移前会自动备份。</w:t>
       </w:r>
     </w:p>
+    <w:p>
+      <w:pPr>
+        <w:pStyle w:val="Heading1"/>
+      </w:pPr>
+      <w:r>
+        <w:rPr>
+          <w:rFonts w:ascii="Calibri" w:hAnsi="Calibri" w:eastAsia="Microsoft YaHei UI"/>
+          <w:b/>
+          <w:color w:val="2E74B5"/>
+          <w:sz w:val="32"/>
+        </w:rPr>
+        <w:t>9. 报告问题</w:t>
+      </w:r>
+    </w:p>
+    <w:p>
+      <w:r>
+        <w:rPr>
+          <w:rFonts w:ascii="Calibri" w:hAnsi="Calibri" w:eastAsia="Microsoft YaHei UI"/>
+          <w:b w:val="0"/>
+          <w:sz w:val="22"/>
+        </w:rPr>
+        <w:t>用途：提交可复现问题，同时避免公开私人或商业数据。</w:t>
+      </w:r>
+    </w:p>
+    <w:p>
+      <w:pPr>
+        <w:spacing w:before="0" w:after="80" w:line="300" w:lineRule="auto"/>
+        <w:numPr>
+          <w:ilvl w:val="0"/>
+          <w:numId w:val="20"/>
+        </w:numPr>
+      </w:pPr>
+      <w:r>
+        <w:rPr>
+          <w:rFonts w:ascii="Calibri" w:hAnsi="Calibri" w:eastAsia="Microsoft YaHei UI"/>
+          <w:b w:val="0"/>
+          <w:sz w:val="22"/>
+        </w:rPr>
+        <w:t>先确认使用最新 GitHub Beta，并按 Issue 模板填写版本、Windows、显示缩放和步骤。</w:t>
+      </w:r>
+    </w:p>
+    <w:p>
+      <w:pPr>
+        <w:spacing w:before="0" w:after="80" w:line="300" w:lineRule="auto"/>
+        <w:numPr>
+          <w:ilvl w:val="0"/>
+          <w:numId w:val="20"/>
+        </w:numPr>
+      </w:pPr>
+      <w:r>
+        <w:rPr>
+          <w:rFonts w:ascii="Calibri" w:hAnsi="Calibri" w:eastAsia="Microsoft YaHei UI"/>
+          <w:b w:val="0"/>
+          <w:sz w:val="22"/>
+        </w:rPr>
+        <w:t>使用合成图或获准公开的图片复现；删除 API Key、私人路径、账号和项目机密。</w:t>
+      </w:r>
+    </w:p>
+    <w:p>
+      <w:pPr>
+        <w:spacing w:before="0" w:after="80" w:line="300" w:lineRule="auto"/>
+        <w:numPr>
+          <w:ilvl w:val="0"/>
+          <w:numId w:val="20"/>
+        </w:numPr>
+      </w:pPr>
+      <w:r>
+        <w:rPr>
+          <w:rFonts w:ascii="Calibri" w:hAnsi="Calibri" w:eastAsia="Microsoft YaHei UI"/>
+          <w:b w:val="0"/>
+          <w:sz w:val="22"/>
+        </w:rPr>
+        <w:t>普通缺陷提交 GitHub Issue；凭据泄露、越权文件写入等安全问题使用私密漏洞报告。</w:t>
+      </w:r>
+    </w:p>
+    <w:p>
+      <w:r>
+        <w:rPr>
+          <w:rFonts w:ascii="Calibri" w:hAnsi="Calibri" w:eastAsia="Microsoft YaHei UI"/>
+          <w:b w:val="0"/>
+          <w:sz w:val="22"/>
+        </w:rPr>
+        <w:t>结果：维护者可以依据最小复现定位问题，公开记录不会包含不应再分发的数据。</w:t>
+      </w:r>
+    </w:p>
     <w:sectPr>
       <w:footerReference w:type="default" r:id="rId9"/>
       <w:pgSz w:w="12240" w:h="15840"/>
@@ -1833,6 +1935,24 @@
   </w:abstractNum>
   <w:num w:numId="19">
     <w:abstractNumId w:val="18"/>
+  </w:num>
+  <w:abstractNum w:abstractNumId="19">
+    <w:multiLevelType w:val="singleLevel"/>
+    <w:lvl w:ilvl="0">
+      <w:start w:val="1"/>
+      <w:numFmt w:val="decimal"/>
+      <w:lvlText w:val="%1."/>
+      <w:lvlJc w:val="left"/>
+      <w:pPr>
+        <w:tabs>
+          <w:tab w:val="num" w:pos="540"/>
+        </w:tabs>
+        <w:ind w:left="540" w:hanging="270"/>
+      </w:pPr>
+    </w:lvl>
+  </w:abstractNum>
+  <w:num w:numId="20">
+    <w:abstractNumId w:val="19"/>
   </w:num>
 </w:numbering>
 </file>

</xml_diff>

<commit_message>
release: publish localized Beta 2 documentation
</commit_message>
<xml_diff>
--- a/GATalk_使用手册.docx
+++ b/GATalk_使用手册.docx
@@ -23,7 +23,17 @@
           <w:b w:val="0"/>
           <w:sz w:val="22"/>
         </w:rPr>
-        <w:t>适用版本：0.18.1 Beta 1；更新日期：2026-08-14</w:t>
+        <w:t>适用版本：0.18.1 Beta 2；更新日期：2026-08-14</w:t>
+      </w:r>
+    </w:p>
+    <w:p>
+      <w:r>
+        <w:rPr>
+          <w:rFonts w:ascii="Calibri" w:hAnsi="Calibri" w:eastAsia="Microsoft YaHei UI"/>
+          <w:b w:val="0"/>
+          <w:sz w:val="22"/>
+        </w:rPr>
+        <w:t>界面语言：简体中文为基准界面；英语、繁体中文、日语和法语目前为预览。</w:t>
       </w:r>
     </w:p>
     <w:p>

</xml_diff>